<commit_message>
writing a service and client nodes communication
</commit_message>
<xml_diff>
--- a/roboticDevelopEnv/work/ros2Notes.docx
+++ b/roboticDevelopEnv/work/ros2Notes.docx
@@ -3624,6 +3624,39 @@
       <w:pPr>
         <w:jc w:val="center"/>
       </w:pPr>
+      <w:r>
+        <w:t>When </w:t>
+      </w:r>
+      <w:hyperlink r:id="rId42" w:history="1">
+        <w:r>
+          <w:rPr>
+            <w:rStyle w:val="Hipervnculo"/>
+          </w:rPr>
+          <w:t>nodes</w:t>
+        </w:r>
+      </w:hyperlink>
+      <w:r>
+        <w:t> communicate using </w:t>
+      </w:r>
+      <w:hyperlink r:id="rId43" w:history="1">
+        <w:r>
+          <w:rPr>
+            <w:rStyle w:val="Hipervnculo"/>
+          </w:rPr>
+          <w:t>services</w:t>
+        </w:r>
+      </w:hyperlink>
+      <w:r>
+        <w:t>, the node that sends a request for data is called the client node, and the one that responds to the request is the service node. The structure of the request and response is determined by a .</w:t>
+      </w:r>
+      <w:proofErr w:type="spellStart"/>
+      <w:r>
+        <w:t>srv</w:t>
+      </w:r>
+      <w:proofErr w:type="spellEnd"/>
+      <w:r>
+        <w:t> file.</w:t>
+      </w:r>
     </w:p>
     <w:p>
       <w:pPr>
@@ -3631,9 +3664,599 @@
       </w:pPr>
     </w:p>
     <w:p>
+      <w:r>
+        <w:t>The example used here is a simple integer addition system; one node requests the sum of two integers, and the other responds with the result.</w:t>
+      </w:r>
+    </w:p>
+    <w:p/>
+    <w:p/>
+    <w:p>
       <w:pPr>
         <w:jc w:val="center"/>
       </w:pPr>
+      <w:r>
+        <w:t>TASKS</w:t>
+      </w:r>
+    </w:p>
+    <w:p>
+      <w:pPr>
+        <w:pStyle w:val="Prrafodelista"/>
+        <w:numPr>
+          <w:ilvl w:val="3"/>
+          <w:numId w:val="4"/>
+        </w:numPr>
+      </w:pPr>
+      <w:r>
+        <w:t xml:space="preserve">CREATE A PACKAGE </w:t>
+      </w:r>
+    </w:p>
+    <w:p>
+      <w:pPr>
+        <w:pStyle w:val="Prrafodelista"/>
+        <w:numPr>
+          <w:ilvl w:val="1"/>
+          <w:numId w:val="4"/>
+        </w:numPr>
+      </w:pPr>
+      <w:r>
+        <w:t xml:space="preserve">On a new terminal, used as underlay sourcing to my ROS2 installation </w:t>
+      </w:r>
+    </w:p>
+    <w:p>
+      <w:r>
+        <w:drawing>
+          <wp:inline distT="0" distB="0" distL="0" distR="0" wp14:anchorId="79DD1783" wp14:editId="6BC59B3E">
+            <wp:extent cx="5731510" cy="2205990"/>
+            <wp:effectExtent l="0" t="0" r="2540" b="3810"/>
+            <wp:docPr id="1809106944" name="Imagen 1" descr="Interfaz de usuario gráfica, Texto&#10;&#10;El contenido generado por IA puede ser incorrecto."/>
+            <wp:cNvGraphicFramePr>
+              <a:graphicFrameLocks xmlns:a="http://schemas.openxmlformats.org/drawingml/2006/main" noChangeAspect="1"/>
+            </wp:cNvGraphicFramePr>
+            <a:graphic xmlns:a="http://schemas.openxmlformats.org/drawingml/2006/main">
+              <a:graphicData uri="http://schemas.openxmlformats.org/drawingml/2006/picture">
+                <pic:pic xmlns:pic="http://schemas.openxmlformats.org/drawingml/2006/picture">
+                  <pic:nvPicPr>
+                    <pic:cNvPr id="1809106944" name="Imagen 1" descr="Interfaz de usuario gráfica, Texto&#10;&#10;El contenido generado por IA puede ser incorrecto."/>
+                    <pic:cNvPicPr/>
+                  </pic:nvPicPr>
+                  <pic:blipFill>
+                    <a:blip r:embed="rId44"/>
+                    <a:stretch>
+                      <a:fillRect/>
+                    </a:stretch>
+                  </pic:blipFill>
+                  <pic:spPr>
+                    <a:xfrm>
+                      <a:off x="0" y="0"/>
+                      <a:ext cx="5731510" cy="2205990"/>
+                    </a:xfrm>
+                    <a:prstGeom prst="rect">
+                      <a:avLst/>
+                    </a:prstGeom>
+                  </pic:spPr>
+                </pic:pic>
+              </a:graphicData>
+            </a:graphic>
+          </wp:inline>
+        </w:drawing>
+      </w:r>
+    </w:p>
+    <w:p/>
+    <w:p>
+      <w:pPr>
+        <w:ind w:left="1080"/>
+      </w:pPr>
+    </w:p>
+    <w:p>
+      <w:pPr>
+        <w:ind w:left="1080"/>
+      </w:pPr>
+    </w:p>
+    <w:p>
+      <w:pPr>
+        <w:ind w:left="1080"/>
+      </w:pPr>
+    </w:p>
+    <w:p>
+      <w:pPr>
+        <w:ind w:left="1080"/>
+      </w:pPr>
+    </w:p>
+    <w:p>
+      <w:pPr>
+        <w:ind w:left="1080"/>
+      </w:pPr>
+      <w:r>
+        <w:t xml:space="preserve">Then, create a package from my </w:t>
+      </w:r>
+      <w:proofErr w:type="spellStart"/>
+      <w:r>
+        <w:t>src</w:t>
+      </w:r>
+      <w:proofErr w:type="spellEnd"/>
+      <w:r>
+        <w:t xml:space="preserve"> </w:t>
+      </w:r>
+      <w:proofErr w:type="spellStart"/>
+      <w:r>
+        <w:t>dir</w:t>
+      </w:r>
+      <w:proofErr w:type="spellEnd"/>
+      <w:r>
+        <w:t xml:space="preserve"> </w:t>
+      </w:r>
+    </w:p>
+    <w:p>
+      <w:pPr>
+        <w:ind w:left="1080"/>
+      </w:pPr>
+    </w:p>
+    <w:p>
+      <w:pPr>
+        <w:pStyle w:val="Prrafodelista"/>
+        <w:ind w:left="1440"/>
+      </w:pPr>
+      <w:r>
+        <w:drawing>
+          <wp:inline distT="0" distB="0" distL="0" distR="0" wp14:anchorId="7817ACFE" wp14:editId="649E0BAB">
+            <wp:extent cx="5731510" cy="3108960"/>
+            <wp:effectExtent l="0" t="0" r="2540" b="0"/>
+            <wp:docPr id="974738215" name="Imagen 1" descr="Texto&#10;&#10;El contenido generado por IA puede ser incorrecto."/>
+            <wp:cNvGraphicFramePr>
+              <a:graphicFrameLocks xmlns:a="http://schemas.openxmlformats.org/drawingml/2006/main" noChangeAspect="1"/>
+            </wp:cNvGraphicFramePr>
+            <a:graphic xmlns:a="http://schemas.openxmlformats.org/drawingml/2006/main">
+              <a:graphicData uri="http://schemas.openxmlformats.org/drawingml/2006/picture">
+                <pic:pic xmlns:pic="http://schemas.openxmlformats.org/drawingml/2006/picture">
+                  <pic:nvPicPr>
+                    <pic:cNvPr id="974738215" name="Imagen 1" descr="Texto&#10;&#10;El contenido generado por IA puede ser incorrecto."/>
+                    <pic:cNvPicPr/>
+                  </pic:nvPicPr>
+                  <pic:blipFill>
+                    <a:blip r:embed="rId45"/>
+                    <a:stretch>
+                      <a:fillRect/>
+                    </a:stretch>
+                  </pic:blipFill>
+                  <pic:spPr>
+                    <a:xfrm>
+                      <a:off x="0" y="0"/>
+                      <a:ext cx="5731510" cy="3108960"/>
+                    </a:xfrm>
+                    <a:prstGeom prst="rect">
+                      <a:avLst/>
+                    </a:prstGeom>
+                  </pic:spPr>
+                </pic:pic>
+              </a:graphicData>
+            </a:graphic>
+          </wp:inline>
+        </w:drawing>
+      </w:r>
+    </w:p>
+    <w:p>
+      <w:pPr>
+        <w:pStyle w:val="Prrafodelista"/>
+        <w:ind w:left="1440"/>
+      </w:pPr>
+    </w:p>
+    <w:p>
+      <w:pPr>
+        <w:pStyle w:val="Prrafodelista"/>
+        <w:ind w:left="1440"/>
+      </w:pPr>
+      <w:r>
+        <w:t>my</w:t>
+      </w:r>
+      <w:r>
+        <w:t xml:space="preserve"> terminal will return a message verifying the creation of package </w:t>
+      </w:r>
+      <w:proofErr w:type="spellStart"/>
+      <w:r>
+        <w:t>py_srvcli</w:t>
+      </w:r>
+      <w:proofErr w:type="spellEnd"/>
+      <w:r>
+        <w:t> and all its necessary files and folders.</w:t>
+      </w:r>
+    </w:p>
+    <w:p>
+      <w:pPr>
+        <w:pStyle w:val="Prrafodelista"/>
+        <w:ind w:left="1440"/>
+      </w:pPr>
+    </w:p>
+    <w:p>
+      <w:pPr>
+        <w:pStyle w:val="Prrafodelista"/>
+        <w:ind w:left="1440"/>
+      </w:pPr>
+      <w:r>
+        <w:t>The --dependencies argument will automatically add the necessary dependency lines to package.xml. </w:t>
+      </w:r>
+      <w:proofErr w:type="spellStart"/>
+      <w:r>
+        <w:t>example_interfaces</w:t>
+      </w:r>
+      <w:proofErr w:type="spellEnd"/>
+      <w:r>
+        <w:t> is the package that includes </w:t>
+      </w:r>
+      <w:hyperlink r:id="rId46" w:history="1">
+        <w:r>
+          <w:rPr>
+            <w:rStyle w:val="Hipervnculo"/>
+          </w:rPr>
+          <w:t>the .</w:t>
+        </w:r>
+        <w:proofErr w:type="spellStart"/>
+        <w:r>
+          <w:rPr>
+            <w:rStyle w:val="Hipervnculo"/>
+          </w:rPr>
+          <w:t>srv</w:t>
+        </w:r>
+        <w:proofErr w:type="spellEnd"/>
+        <w:r>
+          <w:rPr>
+            <w:rStyle w:val="Hipervnculo"/>
+          </w:rPr>
+          <w:t xml:space="preserve"> file</w:t>
+        </w:r>
+      </w:hyperlink>
+      <w:r>
+        <w:t> </w:t>
+      </w:r>
+      <w:r>
+        <w:t xml:space="preserve">that </w:t>
+      </w:r>
+      <w:proofErr w:type="spellStart"/>
+      <w:r>
+        <w:t>i</w:t>
+      </w:r>
+      <w:proofErr w:type="spellEnd"/>
+      <w:r>
+        <w:t xml:space="preserve"> will need to structure  requests and response</w:t>
+      </w:r>
+      <w:r>
+        <w:t xml:space="preserve"> as : </w:t>
+      </w:r>
+    </w:p>
+    <w:p>
+      <w:pPr>
+        <w:pStyle w:val="Prrafodelista"/>
+        <w:ind w:left="1440"/>
+      </w:pPr>
+      <w:r>
+        <w:t>int64 a</w:t>
+      </w:r>
+    </w:p>
+    <w:p>
+      <w:pPr>
+        <w:pStyle w:val="Prrafodelista"/>
+        <w:ind w:left="1440"/>
+      </w:pPr>
+      <w:r>
+        <w:t>int64 b</w:t>
+      </w:r>
+    </w:p>
+    <w:p>
+      <w:pPr>
+        <w:pStyle w:val="Prrafodelista"/>
+        <w:ind w:left="1440"/>
+      </w:pPr>
+      <w:r>
+        <w:t>---</w:t>
+      </w:r>
+    </w:p>
+    <w:p>
+      <w:pPr>
+        <w:pStyle w:val="Prrafodelista"/>
+        <w:ind w:left="1440"/>
+      </w:pPr>
+      <w:r>
+        <w:t>int64 sum</w:t>
+      </w:r>
+    </w:p>
+    <w:p>
+      <w:pPr>
+        <w:pStyle w:val="Prrafodelista"/>
+        <w:numPr>
+          <w:ilvl w:val="1"/>
+          <w:numId w:val="8"/>
+        </w:numPr>
+      </w:pPr>
+      <w:r>
+        <w:t xml:space="preserve">update </w:t>
+      </w:r>
+      <w:proofErr w:type="spellStart"/>
+      <w:r>
+        <w:t>package.xlm</w:t>
+      </w:r>
+      <w:proofErr w:type="spellEnd"/>
+    </w:p>
+    <w:p/>
+    <w:p>
+      <w:r>
+        <w:t xml:space="preserve">as I used the –dependencies option during package creation, I don’t have to manually add dependencies to this file, also, though, add the description, maintainer email and name, and license information to my </w:t>
+      </w:r>
+      <w:proofErr w:type="spellStart"/>
+      <w:r>
+        <w:t>package.xlm</w:t>
+      </w:r>
+      <w:proofErr w:type="spellEnd"/>
+      <w:r>
+        <w:t xml:space="preserve"> </w:t>
+      </w:r>
+    </w:p>
+    <w:p>
+      <w:r>
+        <w:lastRenderedPageBreak/>
+        <w:drawing>
+          <wp:inline distT="0" distB="0" distL="0" distR="0" wp14:anchorId="29164A7F" wp14:editId="05211605">
+            <wp:extent cx="5731510" cy="3855720"/>
+            <wp:effectExtent l="0" t="0" r="2540" b="0"/>
+            <wp:docPr id="1990313719" name="Imagen 1" descr="Texto&#10;&#10;El contenido generado por IA puede ser incorrecto."/>
+            <wp:cNvGraphicFramePr>
+              <a:graphicFrameLocks xmlns:a="http://schemas.openxmlformats.org/drawingml/2006/main" noChangeAspect="1"/>
+            </wp:cNvGraphicFramePr>
+            <a:graphic xmlns:a="http://schemas.openxmlformats.org/drawingml/2006/main">
+              <a:graphicData uri="http://schemas.openxmlformats.org/drawingml/2006/picture">
+                <pic:pic xmlns:pic="http://schemas.openxmlformats.org/drawingml/2006/picture">
+                  <pic:nvPicPr>
+                    <pic:cNvPr id="1990313719" name="Imagen 1" descr="Texto&#10;&#10;El contenido generado por IA puede ser incorrecto."/>
+                    <pic:cNvPicPr/>
+                  </pic:nvPicPr>
+                  <pic:blipFill>
+                    <a:blip r:embed="rId47"/>
+                    <a:stretch>
+                      <a:fillRect/>
+                    </a:stretch>
+                  </pic:blipFill>
+                  <pic:spPr>
+                    <a:xfrm>
+                      <a:off x="0" y="0"/>
+                      <a:ext cx="5731510" cy="3855720"/>
+                    </a:xfrm>
+                    <a:prstGeom prst="rect">
+                      <a:avLst/>
+                    </a:prstGeom>
+                  </pic:spPr>
+                </pic:pic>
+              </a:graphicData>
+            </a:graphic>
+          </wp:inline>
+        </w:drawing>
+      </w:r>
+    </w:p>
+    <w:p>
+      <w:r>
+        <w:t>to match with the setup.py</w:t>
+      </w:r>
+    </w:p>
+    <w:p/>
+    <w:p/>
+    <w:p/>
+    <w:p/>
+    <w:p>
+      <w:pPr>
+        <w:pStyle w:val="Prrafodelista"/>
+        <w:numPr>
+          <w:ilvl w:val="1"/>
+          <w:numId w:val="8"/>
+        </w:numPr>
+      </w:pPr>
+      <w:r>
+        <w:t xml:space="preserve"> update setup.py </w:t>
+      </w:r>
+    </w:p>
+    <w:p>
+      <w:r>
+        <w:lastRenderedPageBreak/>
+        <w:drawing>
+          <wp:inline distT="0" distB="0" distL="0" distR="0" wp14:anchorId="0493D0C3" wp14:editId="362E37D9">
+            <wp:extent cx="5731510" cy="5647055"/>
+            <wp:effectExtent l="0" t="0" r="2540" b="0"/>
+            <wp:docPr id="457456803" name="Imagen 1" descr="Texto&#10;&#10;El contenido generado por IA puede ser incorrecto."/>
+            <wp:cNvGraphicFramePr>
+              <a:graphicFrameLocks xmlns:a="http://schemas.openxmlformats.org/drawingml/2006/main" noChangeAspect="1"/>
+            </wp:cNvGraphicFramePr>
+            <a:graphic xmlns:a="http://schemas.openxmlformats.org/drawingml/2006/main">
+              <a:graphicData uri="http://schemas.openxmlformats.org/drawingml/2006/picture">
+                <pic:pic xmlns:pic="http://schemas.openxmlformats.org/drawingml/2006/picture">
+                  <pic:nvPicPr>
+                    <pic:cNvPr id="457456803" name="Imagen 1" descr="Texto&#10;&#10;El contenido generado por IA puede ser incorrecto."/>
+                    <pic:cNvPicPr/>
+                  </pic:nvPicPr>
+                  <pic:blipFill>
+                    <a:blip r:embed="rId48"/>
+                    <a:stretch>
+                      <a:fillRect/>
+                    </a:stretch>
+                  </pic:blipFill>
+                  <pic:spPr>
+                    <a:xfrm>
+                      <a:off x="0" y="0"/>
+                      <a:ext cx="5731510" cy="5647055"/>
+                    </a:xfrm>
+                    <a:prstGeom prst="rect">
+                      <a:avLst/>
+                    </a:prstGeom>
+                  </pic:spPr>
+                </pic:pic>
+              </a:graphicData>
+            </a:graphic>
+          </wp:inline>
+        </w:drawing>
+      </w:r>
+    </w:p>
+    <w:p>
+      <w:pPr>
+        <w:jc w:val="center"/>
+      </w:pPr>
+    </w:p>
+    <w:p>
+      <w:pPr>
+        <w:jc w:val="center"/>
+      </w:pPr>
+    </w:p>
+    <w:p>
+      <w:r>
+        <w:t>2.  WRITING THE SERVICE NODE +</w:t>
+      </w:r>
+    </w:p>
+    <w:p>
+      <w:r>
+        <w:t xml:space="preserve">On the package folder, not the </w:t>
+      </w:r>
+      <w:proofErr w:type="spellStart"/>
+      <w:r>
+        <w:t>dir</w:t>
+      </w:r>
+      <w:proofErr w:type="spellEnd"/>
+      <w:r>
+        <w:t xml:space="preserve"> of my package, create a file called </w:t>
+      </w:r>
+    </w:p>
+    <w:p>
+      <w:r>
+        <w:t>Service_member_function.py and paste the following code</w:t>
+      </w:r>
+    </w:p>
+    <w:p>
+      <w:r>
+        <w:lastRenderedPageBreak/>
+        <w:drawing>
+          <wp:inline distT="0" distB="0" distL="0" distR="0" wp14:anchorId="757BC9D7" wp14:editId="1E819B3C">
+            <wp:extent cx="5731510" cy="4944745"/>
+            <wp:effectExtent l="0" t="0" r="2540" b="8255"/>
+            <wp:docPr id="653887291" name="Imagen 1" descr="Texto&#10;&#10;El contenido generado por IA puede ser incorrecto."/>
+            <wp:cNvGraphicFramePr>
+              <a:graphicFrameLocks xmlns:a="http://schemas.openxmlformats.org/drawingml/2006/main" noChangeAspect="1"/>
+            </wp:cNvGraphicFramePr>
+            <a:graphic xmlns:a="http://schemas.openxmlformats.org/drawingml/2006/main">
+              <a:graphicData uri="http://schemas.openxmlformats.org/drawingml/2006/picture">
+                <pic:pic xmlns:pic="http://schemas.openxmlformats.org/drawingml/2006/picture">
+                  <pic:nvPicPr>
+                    <pic:cNvPr id="653887291" name="Imagen 1" descr="Texto&#10;&#10;El contenido generado por IA puede ser incorrecto."/>
+                    <pic:cNvPicPr/>
+                  </pic:nvPicPr>
+                  <pic:blipFill>
+                    <a:blip r:embed="rId49"/>
+                    <a:stretch>
+                      <a:fillRect/>
+                    </a:stretch>
+                  </pic:blipFill>
+                  <pic:spPr>
+                    <a:xfrm>
+                      <a:off x="0" y="0"/>
+                      <a:ext cx="5731510" cy="4944745"/>
+                    </a:xfrm>
+                    <a:prstGeom prst="rect">
+                      <a:avLst/>
+                    </a:prstGeom>
+                  </pic:spPr>
+                </pic:pic>
+              </a:graphicData>
+            </a:graphic>
+          </wp:inline>
+        </w:drawing>
+      </w:r>
+    </w:p>
+    <w:p/>
+    <w:p>
+      <w:r>
+        <w:t xml:space="preserve">2.2 now ADD AN ENTRY POINT </w:t>
+      </w:r>
+    </w:p>
+    <w:p>
+      <w:r>
+        <w:t xml:space="preserve">To allow THE ROS2 RUN COMMAND ON MY RUN NODE, I must add the entry point to setup.py located on my package folder, not the package as </w:t>
+      </w:r>
+      <w:proofErr w:type="gramStart"/>
+      <w:r>
+        <w:t>well .</w:t>
+      </w:r>
+      <w:proofErr w:type="gramEnd"/>
+      <w:r>
+        <w:t xml:space="preserve"> </w:t>
+      </w:r>
+    </w:p>
+    <w:p/>
+    <w:p>
+      <w:r>
+        <w:tab/>
+        <w:t xml:space="preserve">BETWEEN CONSOLE SCRIPTS: </w:t>
+      </w:r>
+    </w:p>
+    <w:p>
+      <w:r>
+        <w:lastRenderedPageBreak/>
+        <w:drawing>
+          <wp:inline distT="0" distB="0" distL="0" distR="0" wp14:anchorId="145C13F0" wp14:editId="1430747F">
+            <wp:extent cx="5570220" cy="5375824"/>
+            <wp:effectExtent l="0" t="0" r="0" b="0"/>
+            <wp:docPr id="737146565" name="Imagen 1" descr="Texto&#10;&#10;El contenido generado por IA puede ser incorrecto."/>
+            <wp:cNvGraphicFramePr>
+              <a:graphicFrameLocks xmlns:a="http://schemas.openxmlformats.org/drawingml/2006/main" noChangeAspect="1"/>
+            </wp:cNvGraphicFramePr>
+            <a:graphic xmlns:a="http://schemas.openxmlformats.org/drawingml/2006/main">
+              <a:graphicData uri="http://schemas.openxmlformats.org/drawingml/2006/picture">
+                <pic:pic xmlns:pic="http://schemas.openxmlformats.org/drawingml/2006/picture">
+                  <pic:nvPicPr>
+                    <pic:cNvPr id="737146565" name="Imagen 1" descr="Texto&#10;&#10;El contenido generado por IA puede ser incorrecto."/>
+                    <pic:cNvPicPr/>
+                  </pic:nvPicPr>
+                  <pic:blipFill>
+                    <a:blip r:embed="rId50"/>
+                    <a:stretch>
+                      <a:fillRect/>
+                    </a:stretch>
+                  </pic:blipFill>
+                  <pic:spPr>
+                    <a:xfrm>
+                      <a:off x="0" y="0"/>
+                      <a:ext cx="5571228" cy="5376797"/>
+                    </a:xfrm>
+                    <a:prstGeom prst="rect">
+                      <a:avLst/>
+                    </a:prstGeom>
+                  </pic:spPr>
+                </pic:pic>
+              </a:graphicData>
+            </a:graphic>
+          </wp:inline>
+        </w:drawing>
+      </w:r>
+    </w:p>
+    <w:p>
+      <w:r>
+        <w:t xml:space="preserve">Add the service from my package as </w:t>
+      </w:r>
+      <w:proofErr w:type="gramStart"/>
+      <w:r>
+        <w:t>my</w:t>
+      </w:r>
+      <w:proofErr w:type="gramEnd"/>
+      <w:r>
+        <w:t xml:space="preserve"> .</w:t>
+      </w:r>
+      <w:proofErr w:type="spellStart"/>
+      <w:r>
+        <w:t>py</w:t>
+      </w:r>
+      <w:proofErr w:type="spellEnd"/>
+      <w:r>
+        <w:t xml:space="preserve"> file, where </w:t>
+      </w:r>
+      <w:proofErr w:type="gramStart"/>
+      <w:r>
+        <w:t>its</w:t>
+      </w:r>
+      <w:proofErr w:type="gramEnd"/>
+      <w:r>
+        <w:t xml:space="preserve"> called the main function </w:t>
+      </w:r>
     </w:p>
     <w:p>
       <w:pPr>
@@ -3641,6 +4264,696 @@
           <w:bottom w:val="single" w:sz="6" w:space="1" w:color="auto"/>
         </w:pBdr>
         <w:jc w:val="center"/>
+      </w:pPr>
+    </w:p>
+    <w:p>
+      <w:pPr>
+        <w:pBdr>
+          <w:bottom w:val="single" w:sz="6" w:space="1" w:color="auto"/>
+        </w:pBdr>
+        <w:jc w:val="center"/>
+      </w:pPr>
+    </w:p>
+    <w:p>
+      <w:pPr>
+        <w:pBdr>
+          <w:bottom w:val="single" w:sz="6" w:space="1" w:color="auto"/>
+        </w:pBdr>
+      </w:pPr>
+      <w:r>
+        <w:t xml:space="preserve">3. </w:t>
+      </w:r>
+      <w:r>
+        <w:t xml:space="preserve">WRITE NOW THE CLIENT </w:t>
+      </w:r>
+      <w:proofErr w:type="gramStart"/>
+      <w:r>
+        <w:t>NODE :</w:t>
+      </w:r>
+      <w:proofErr w:type="gramEnd"/>
+      <w:r>
+        <w:t xml:space="preserve"> </w:t>
+      </w:r>
+    </w:p>
+    <w:p>
+      <w:pPr>
+        <w:pBdr>
+          <w:bottom w:val="single" w:sz="6" w:space="1" w:color="auto"/>
+        </w:pBdr>
+      </w:pPr>
+    </w:p>
+    <w:p>
+      <w:pPr>
+        <w:pBdr>
+          <w:bottom w:val="single" w:sz="6" w:space="1" w:color="auto"/>
+        </w:pBdr>
+      </w:pPr>
+    </w:p>
+    <w:p>
+      <w:pPr>
+        <w:pBdr>
+          <w:bottom w:val="single" w:sz="6" w:space="1" w:color="auto"/>
+        </w:pBdr>
+      </w:pPr>
+      <w:r>
+        <w:t xml:space="preserve">Using a </w:t>
+      </w:r>
+      <w:proofErr w:type="spellStart"/>
+      <w:r>
+        <w:t>client_member</w:t>
+      </w:r>
+      <w:proofErr w:type="spellEnd"/>
+      <w:r>
+        <w:t xml:space="preserve"> function </w:t>
+      </w:r>
+      <w:proofErr w:type="gramStart"/>
+      <w:r>
+        <w:t>and also</w:t>
+      </w:r>
+      <w:proofErr w:type="gramEnd"/>
+      <w:r>
+        <w:t xml:space="preserve"> copying this </w:t>
+      </w:r>
+      <w:proofErr w:type="gramStart"/>
+      <w:r>
+        <w:t>process :</w:t>
+      </w:r>
+      <w:proofErr w:type="gramEnd"/>
+      <w:r>
+        <w:t xml:space="preserve"> </w:t>
+      </w:r>
+    </w:p>
+    <w:p>
+      <w:pPr>
+        <w:pBdr>
+          <w:bottom w:val="single" w:sz="6" w:space="1" w:color="auto"/>
+        </w:pBdr>
+      </w:pPr>
+    </w:p>
+    <w:p>
+      <w:pPr>
+        <w:pBdr>
+          <w:bottom w:val="single" w:sz="6" w:space="1" w:color="auto"/>
+        </w:pBdr>
+      </w:pPr>
+      <w:r>
+        <w:t xml:space="preserve">Inside of my </w:t>
+      </w:r>
+      <w:proofErr w:type="gramStart"/>
+      <w:r>
+        <w:t>package :</w:t>
+      </w:r>
+      <w:proofErr w:type="gramEnd"/>
+      <w:r>
+        <w:t xml:space="preserve"> </w:t>
+      </w:r>
+    </w:p>
+    <w:p>
+      <w:pPr>
+        <w:pBdr>
+          <w:bottom w:val="single" w:sz="6" w:space="1" w:color="auto"/>
+        </w:pBdr>
+      </w:pPr>
+    </w:p>
+    <w:p>
+      <w:pPr>
+        <w:pBdr>
+          <w:bottom w:val="single" w:sz="6" w:space="1" w:color="auto"/>
+        </w:pBdr>
+      </w:pPr>
+    </w:p>
+    <w:p>
+      <w:pPr>
+        <w:pBdr>
+          <w:bottom w:val="single" w:sz="6" w:space="1" w:color="auto"/>
+        </w:pBdr>
+      </w:pPr>
+      <w:r>
+        <w:lastRenderedPageBreak/>
+        <w:drawing>
+          <wp:inline distT="0" distB="0" distL="0" distR="0" wp14:anchorId="5A115553" wp14:editId="593D2CBD">
+            <wp:extent cx="5731510" cy="5241290"/>
+            <wp:effectExtent l="0" t="0" r="2540" b="0"/>
+            <wp:docPr id="2088251637" name="Imagen 1" descr="Texto&#10;&#10;El contenido generado por IA puede ser incorrecto."/>
+            <wp:cNvGraphicFramePr>
+              <a:graphicFrameLocks xmlns:a="http://schemas.openxmlformats.org/drawingml/2006/main" noChangeAspect="1"/>
+            </wp:cNvGraphicFramePr>
+            <a:graphic xmlns:a="http://schemas.openxmlformats.org/drawingml/2006/main">
+              <a:graphicData uri="http://schemas.openxmlformats.org/drawingml/2006/picture">
+                <pic:pic xmlns:pic="http://schemas.openxmlformats.org/drawingml/2006/picture">
+                  <pic:nvPicPr>
+                    <pic:cNvPr id="2088251637" name="Imagen 1" descr="Texto&#10;&#10;El contenido generado por IA puede ser incorrecto."/>
+                    <pic:cNvPicPr/>
+                  </pic:nvPicPr>
+                  <pic:blipFill>
+                    <a:blip r:embed="rId51"/>
+                    <a:stretch>
+                      <a:fillRect/>
+                    </a:stretch>
+                  </pic:blipFill>
+                  <pic:spPr>
+                    <a:xfrm>
+                      <a:off x="0" y="0"/>
+                      <a:ext cx="5731510" cy="5241290"/>
+                    </a:xfrm>
+                    <a:prstGeom prst="rect">
+                      <a:avLst/>
+                    </a:prstGeom>
+                  </pic:spPr>
+                </pic:pic>
+              </a:graphicData>
+            </a:graphic>
+          </wp:inline>
+        </w:drawing>
+      </w:r>
+    </w:p>
+    <w:p>
+      <w:pPr>
+        <w:pBdr>
+          <w:bottom w:val="single" w:sz="6" w:space="1" w:color="auto"/>
+        </w:pBdr>
+      </w:pPr>
+      <w:r>
+        <w:t xml:space="preserve">3.2 also make sure that I add the entry point bellow my service member function point </w:t>
+      </w:r>
+    </w:p>
+    <w:p>
+      <w:pPr>
+        <w:pBdr>
+          <w:bottom w:val="single" w:sz="6" w:space="1" w:color="auto"/>
+        </w:pBdr>
+      </w:pPr>
+    </w:p>
+    <w:p>
+      <w:pPr>
+        <w:pBdr>
+          <w:bottom w:val="single" w:sz="6" w:space="1" w:color="auto"/>
+        </w:pBdr>
+      </w:pPr>
+      <w:r>
+        <w:lastRenderedPageBreak/>
+        <w:drawing>
+          <wp:inline distT="0" distB="0" distL="0" distR="0" wp14:anchorId="4A3F3A97" wp14:editId="77F3B65C">
+            <wp:extent cx="5731510" cy="5063490"/>
+            <wp:effectExtent l="0" t="0" r="2540" b="3810"/>
+            <wp:docPr id="1220231832" name="Imagen 1" descr="Texto&#10;&#10;El contenido generado por IA puede ser incorrecto."/>
+            <wp:cNvGraphicFramePr>
+              <a:graphicFrameLocks xmlns:a="http://schemas.openxmlformats.org/drawingml/2006/main" noChangeAspect="1"/>
+            </wp:cNvGraphicFramePr>
+            <a:graphic xmlns:a="http://schemas.openxmlformats.org/drawingml/2006/main">
+              <a:graphicData uri="http://schemas.openxmlformats.org/drawingml/2006/picture">
+                <pic:pic xmlns:pic="http://schemas.openxmlformats.org/drawingml/2006/picture">
+                  <pic:nvPicPr>
+                    <pic:cNvPr id="1220231832" name="Imagen 1" descr="Texto&#10;&#10;El contenido generado por IA puede ser incorrecto."/>
+                    <pic:cNvPicPr/>
+                  </pic:nvPicPr>
+                  <pic:blipFill>
+                    <a:blip r:embed="rId52"/>
+                    <a:stretch>
+                      <a:fillRect/>
+                    </a:stretch>
+                  </pic:blipFill>
+                  <pic:spPr>
+                    <a:xfrm>
+                      <a:off x="0" y="0"/>
+                      <a:ext cx="5731510" cy="5063490"/>
+                    </a:xfrm>
+                    <a:prstGeom prst="rect">
+                      <a:avLst/>
+                    </a:prstGeom>
+                  </pic:spPr>
+                </pic:pic>
+              </a:graphicData>
+            </a:graphic>
+          </wp:inline>
+        </w:drawing>
+      </w:r>
+    </w:p>
+    <w:p>
+      <w:pPr>
+        <w:pBdr>
+          <w:bottom w:val="single" w:sz="6" w:space="1" w:color="auto"/>
+        </w:pBdr>
+      </w:pPr>
+    </w:p>
+    <w:p>
+      <w:pPr>
+        <w:pBdr>
+          <w:bottom w:val="single" w:sz="6" w:space="1" w:color="auto"/>
+        </w:pBdr>
+      </w:pPr>
+      <w:r>
+        <w:t>4. PROCEED BUILDING AND RUNNING</w:t>
+      </w:r>
+    </w:p>
+    <w:p>
+      <w:pPr>
+        <w:pBdr>
+          <w:bottom w:val="single" w:sz="6" w:space="1" w:color="auto"/>
+        </w:pBdr>
+      </w:pPr>
+      <w:r>
+        <w:t xml:space="preserve">Remember that </w:t>
+      </w:r>
+      <w:r>
+        <w:t>It’s good practice to run </w:t>
+      </w:r>
+      <w:proofErr w:type="spellStart"/>
+      <w:r>
+        <w:t>rosdep</w:t>
+      </w:r>
+      <w:proofErr w:type="spellEnd"/>
+      <w:r>
+        <w:t> in the root of your workspace (ros2_ws) to check for missing dependencies before building:</w:t>
+      </w:r>
+    </w:p>
+    <w:p>
+      <w:pPr>
+        <w:pBdr>
+          <w:bottom w:val="single" w:sz="6" w:space="1" w:color="auto"/>
+        </w:pBdr>
+      </w:pPr>
+    </w:p>
+    <w:p>
+      <w:pPr>
+        <w:pBdr>
+          <w:bottom w:val="single" w:sz="6" w:space="1" w:color="auto"/>
+        </w:pBdr>
+      </w:pPr>
+      <w:r>
+        <w:t xml:space="preserve">Also remember that this </w:t>
+      </w:r>
+      <w:proofErr w:type="gramStart"/>
+      <w:r>
+        <w:t>has to</w:t>
+      </w:r>
+      <w:proofErr w:type="gramEnd"/>
+      <w:r>
+        <w:t xml:space="preserve"> be run on my </w:t>
+      </w:r>
+      <w:proofErr w:type="spellStart"/>
+      <w:r>
+        <w:t>ws</w:t>
+      </w:r>
+      <w:proofErr w:type="spellEnd"/>
+      <w:r>
+        <w:t xml:space="preserve"> root .:</w:t>
+      </w:r>
+    </w:p>
+    <w:p>
+      <w:pPr>
+        <w:pBdr>
+          <w:bottom w:val="single" w:sz="6" w:space="1" w:color="auto"/>
+        </w:pBdr>
+      </w:pPr>
+      <w:r>
+        <w:drawing>
+          <wp:inline distT="0" distB="0" distL="0" distR="0" wp14:anchorId="5C1584C0" wp14:editId="53C65B4D">
+            <wp:extent cx="5731510" cy="1790700"/>
+            <wp:effectExtent l="0" t="0" r="2540" b="0"/>
+            <wp:docPr id="1106160703" name="Imagen 1" descr="Texto&#10;&#10;El contenido generado por IA puede ser incorrecto."/>
+            <wp:cNvGraphicFramePr>
+              <a:graphicFrameLocks xmlns:a="http://schemas.openxmlformats.org/drawingml/2006/main" noChangeAspect="1"/>
+            </wp:cNvGraphicFramePr>
+            <a:graphic xmlns:a="http://schemas.openxmlformats.org/drawingml/2006/main">
+              <a:graphicData uri="http://schemas.openxmlformats.org/drawingml/2006/picture">
+                <pic:pic xmlns:pic="http://schemas.openxmlformats.org/drawingml/2006/picture">
+                  <pic:nvPicPr>
+                    <pic:cNvPr id="1106160703" name="Imagen 1" descr="Texto&#10;&#10;El contenido generado por IA puede ser incorrecto."/>
+                    <pic:cNvPicPr/>
+                  </pic:nvPicPr>
+                  <pic:blipFill>
+                    <a:blip r:embed="rId53"/>
+                    <a:stretch>
+                      <a:fillRect/>
+                    </a:stretch>
+                  </pic:blipFill>
+                  <pic:spPr>
+                    <a:xfrm>
+                      <a:off x="0" y="0"/>
+                      <a:ext cx="5731510" cy="1790700"/>
+                    </a:xfrm>
+                    <a:prstGeom prst="rect">
+                      <a:avLst/>
+                    </a:prstGeom>
+                  </pic:spPr>
+                </pic:pic>
+              </a:graphicData>
+            </a:graphic>
+          </wp:inline>
+        </w:drawing>
+      </w:r>
+    </w:p>
+    <w:p>
+      <w:r>
+        <w:lastRenderedPageBreak/>
+        <w:t xml:space="preserve">Another thing to do this is build the package using </w:t>
+      </w:r>
+      <w:proofErr w:type="spellStart"/>
+      <w:r>
+        <w:t>colcon</w:t>
+      </w:r>
+      <w:proofErr w:type="spellEnd"/>
+      <w:r>
+        <w:t xml:space="preserve"> </w:t>
+      </w:r>
+    </w:p>
+    <w:p/>
+    <w:p>
+      <w:r>
+        <w:drawing>
+          <wp:inline distT="0" distB="0" distL="0" distR="0" wp14:anchorId="29A03FC5" wp14:editId="53A88FB1">
+            <wp:extent cx="5731510" cy="809625"/>
+            <wp:effectExtent l="0" t="0" r="2540" b="9525"/>
+            <wp:docPr id="1220697487" name="Imagen 1" descr="Interfaz de usuario gráfica, Texto&#10;&#10;El contenido generado por IA puede ser incorrecto."/>
+            <wp:cNvGraphicFramePr>
+              <a:graphicFrameLocks xmlns:a="http://schemas.openxmlformats.org/drawingml/2006/main" noChangeAspect="1"/>
+            </wp:cNvGraphicFramePr>
+            <a:graphic xmlns:a="http://schemas.openxmlformats.org/drawingml/2006/main">
+              <a:graphicData uri="http://schemas.openxmlformats.org/drawingml/2006/picture">
+                <pic:pic xmlns:pic="http://schemas.openxmlformats.org/drawingml/2006/picture">
+                  <pic:nvPicPr>
+                    <pic:cNvPr id="1220697487" name="Imagen 1" descr="Interfaz de usuario gráfica, Texto&#10;&#10;El contenido generado por IA puede ser incorrecto."/>
+                    <pic:cNvPicPr/>
+                  </pic:nvPicPr>
+                  <pic:blipFill>
+                    <a:blip r:embed="rId54"/>
+                    <a:stretch>
+                      <a:fillRect/>
+                    </a:stretch>
+                  </pic:blipFill>
+                  <pic:spPr>
+                    <a:xfrm>
+                      <a:off x="0" y="0"/>
+                      <a:ext cx="5731510" cy="809625"/>
+                    </a:xfrm>
+                    <a:prstGeom prst="rect">
+                      <a:avLst/>
+                    </a:prstGeom>
+                  </pic:spPr>
+                </pic:pic>
+              </a:graphicData>
+            </a:graphic>
+          </wp:inline>
+        </w:drawing>
+      </w:r>
+    </w:p>
+    <w:p>
+      <w:r>
+        <w:t>5. RUN</w:t>
+      </w:r>
+    </w:p>
+    <w:p/>
+    <w:p>
+      <w:r>
+        <w:t xml:space="preserve">OPEN A NEW TERMINAL, THEN NAVIGATE TO MY WS, and sourcing the bash, then run a service node, this is my OVERLAY LABEL </w:t>
+      </w:r>
+    </w:p>
+    <w:p>
+      <w:r>
+        <w:drawing>
+          <wp:inline distT="0" distB="0" distL="0" distR="0" wp14:anchorId="5A9D4782" wp14:editId="5CAEDA31">
+            <wp:extent cx="5731510" cy="2540635"/>
+            <wp:effectExtent l="0" t="0" r="2540" b="0"/>
+            <wp:docPr id="733695110" name="Imagen 1" descr="Texto&#10;&#10;El contenido generado por IA puede ser incorrecto."/>
+            <wp:cNvGraphicFramePr>
+              <a:graphicFrameLocks xmlns:a="http://schemas.openxmlformats.org/drawingml/2006/main" noChangeAspect="1"/>
+            </wp:cNvGraphicFramePr>
+            <a:graphic xmlns:a="http://schemas.openxmlformats.org/drawingml/2006/main">
+              <a:graphicData uri="http://schemas.openxmlformats.org/drawingml/2006/picture">
+                <pic:pic xmlns:pic="http://schemas.openxmlformats.org/drawingml/2006/picture">
+                  <pic:nvPicPr>
+                    <pic:cNvPr id="733695110" name="Imagen 1" descr="Texto&#10;&#10;El contenido generado por IA puede ser incorrecto."/>
+                    <pic:cNvPicPr/>
+                  </pic:nvPicPr>
+                  <pic:blipFill>
+                    <a:blip r:embed="rId55"/>
+                    <a:stretch>
+                      <a:fillRect/>
+                    </a:stretch>
+                  </pic:blipFill>
+                  <pic:spPr>
+                    <a:xfrm>
+                      <a:off x="0" y="0"/>
+                      <a:ext cx="5731510" cy="2540635"/>
+                    </a:xfrm>
+                    <a:prstGeom prst="rect">
+                      <a:avLst/>
+                    </a:prstGeom>
+                  </pic:spPr>
+                </pic:pic>
+              </a:graphicData>
+            </a:graphic>
+          </wp:inline>
+        </w:drawing>
+      </w:r>
+    </w:p>
+    <w:p/>
+    <w:p>
+      <w:r>
+        <w:t xml:space="preserve">The service node will wait fort the client’s request. </w:t>
+      </w:r>
+    </w:p>
+    <w:p>
+      <w:r>
+        <w:t xml:space="preserve">Now, I OPEN ANEW TERMINAL, SOURCE WITH THE BASH ON MY INSTALL AND THEN RUN MY CLIENT NODE followed by two integers known as the integers to make the sum </w:t>
+      </w:r>
+    </w:p>
+    <w:p/>
+    <w:p>
+      <w:r>
+        <w:drawing>
+          <wp:inline distT="0" distB="0" distL="0" distR="0" wp14:anchorId="4B547F24" wp14:editId="7BBC01A0">
+            <wp:extent cx="5731510" cy="1490980"/>
+            <wp:effectExtent l="0" t="0" r="2540" b="0"/>
+            <wp:docPr id="1712636677" name="Imagen 1" descr="Texto&#10;&#10;El contenido generado por IA puede ser incorrecto."/>
+            <wp:cNvGraphicFramePr>
+              <a:graphicFrameLocks xmlns:a="http://schemas.openxmlformats.org/drawingml/2006/main" noChangeAspect="1"/>
+            </wp:cNvGraphicFramePr>
+            <a:graphic xmlns:a="http://schemas.openxmlformats.org/drawingml/2006/main">
+              <a:graphicData uri="http://schemas.openxmlformats.org/drawingml/2006/picture">
+                <pic:pic xmlns:pic="http://schemas.openxmlformats.org/drawingml/2006/picture">
+                  <pic:nvPicPr>
+                    <pic:cNvPr id="1712636677" name="Imagen 1" descr="Texto&#10;&#10;El contenido generado por IA puede ser incorrecto."/>
+                    <pic:cNvPicPr/>
+                  </pic:nvPicPr>
+                  <pic:blipFill>
+                    <a:blip r:embed="rId56"/>
+                    <a:stretch>
+                      <a:fillRect/>
+                    </a:stretch>
+                  </pic:blipFill>
+                  <pic:spPr>
+                    <a:xfrm>
+                      <a:off x="0" y="0"/>
+                      <a:ext cx="5731510" cy="1490980"/>
+                    </a:xfrm>
+                    <a:prstGeom prst="rect">
+                      <a:avLst/>
+                    </a:prstGeom>
+                  </pic:spPr>
+                </pic:pic>
+              </a:graphicData>
+            </a:graphic>
+          </wp:inline>
+        </w:drawing>
+      </w:r>
+    </w:p>
+    <w:p>
+      <w:r>
+        <w:lastRenderedPageBreak/>
+        <w:t xml:space="preserve">Now seeing my SERVICE </w:t>
+      </w:r>
+      <w:proofErr w:type="gramStart"/>
+      <w:r>
+        <w:t>NODE :</w:t>
+      </w:r>
+      <w:proofErr w:type="gramEnd"/>
+      <w:r>
+        <w:t xml:space="preserve"> </w:t>
+      </w:r>
+      <w:r>
+        <w:br/>
+      </w:r>
+      <w:r>
+        <w:drawing>
+          <wp:inline distT="0" distB="0" distL="0" distR="0" wp14:anchorId="50255CE2" wp14:editId="694994E3">
+            <wp:extent cx="5731510" cy="2329180"/>
+            <wp:effectExtent l="0" t="0" r="2540" b="0"/>
+            <wp:docPr id="2056696108" name="Imagen 1" descr="Texto&#10;&#10;El contenido generado por IA puede ser incorrecto."/>
+            <wp:cNvGraphicFramePr>
+              <a:graphicFrameLocks xmlns:a="http://schemas.openxmlformats.org/drawingml/2006/main" noChangeAspect="1"/>
+            </wp:cNvGraphicFramePr>
+            <a:graphic xmlns:a="http://schemas.openxmlformats.org/drawingml/2006/main">
+              <a:graphicData uri="http://schemas.openxmlformats.org/drawingml/2006/picture">
+                <pic:pic xmlns:pic="http://schemas.openxmlformats.org/drawingml/2006/picture">
+                  <pic:nvPicPr>
+                    <pic:cNvPr id="2056696108" name="Imagen 1" descr="Texto&#10;&#10;El contenido generado por IA puede ser incorrecto."/>
+                    <pic:cNvPicPr/>
+                  </pic:nvPicPr>
+                  <pic:blipFill>
+                    <a:blip r:embed="rId57"/>
+                    <a:stretch>
+                      <a:fillRect/>
+                    </a:stretch>
+                  </pic:blipFill>
+                  <pic:spPr>
+                    <a:xfrm>
+                      <a:off x="0" y="0"/>
+                      <a:ext cx="5731510" cy="2329180"/>
+                    </a:xfrm>
+                    <a:prstGeom prst="rect">
+                      <a:avLst/>
+                    </a:prstGeom>
+                  </pic:spPr>
+                </pic:pic>
+              </a:graphicData>
+            </a:graphic>
+          </wp:inline>
+        </w:drawing>
+      </w:r>
+    </w:p>
+    <w:p>
+      <w:r>
+        <w:t xml:space="preserve">NOTE THAT MY CLIENT NODE PUBLISH THE </w:t>
+      </w:r>
+      <w:proofErr w:type="gramStart"/>
+      <w:r>
+        <w:t>RESULT :</w:t>
+      </w:r>
+      <w:proofErr w:type="gramEnd"/>
+      <w:r>
+        <w:t xml:space="preserve"> </w:t>
+      </w:r>
+    </w:p>
+    <w:p>
+      <w:r>
+        <w:drawing>
+          <wp:inline distT="0" distB="0" distL="0" distR="0" wp14:anchorId="38781906" wp14:editId="462E8E86">
+            <wp:extent cx="5731510" cy="1852295"/>
+            <wp:effectExtent l="0" t="0" r="2540" b="0"/>
+            <wp:docPr id="1925785521" name="Imagen 1" descr="Texto&#10;&#10;El contenido generado por IA puede ser incorrecto."/>
+            <wp:cNvGraphicFramePr>
+              <a:graphicFrameLocks xmlns:a="http://schemas.openxmlformats.org/drawingml/2006/main" noChangeAspect="1"/>
+            </wp:cNvGraphicFramePr>
+            <a:graphic xmlns:a="http://schemas.openxmlformats.org/drawingml/2006/main">
+              <a:graphicData uri="http://schemas.openxmlformats.org/drawingml/2006/picture">
+                <pic:pic xmlns:pic="http://schemas.openxmlformats.org/drawingml/2006/picture">
+                  <pic:nvPicPr>
+                    <pic:cNvPr id="1925785521" name="Imagen 1" descr="Texto&#10;&#10;El contenido generado por IA puede ser incorrecto."/>
+                    <pic:cNvPicPr/>
+                  </pic:nvPicPr>
+                  <pic:blipFill>
+                    <a:blip r:embed="rId58"/>
+                    <a:stretch>
+                      <a:fillRect/>
+                    </a:stretch>
+                  </pic:blipFill>
+                  <pic:spPr>
+                    <a:xfrm>
+                      <a:off x="0" y="0"/>
+                      <a:ext cx="5731510" cy="1852295"/>
+                    </a:xfrm>
+                    <a:prstGeom prst="rect">
+                      <a:avLst/>
+                    </a:prstGeom>
+                  </pic:spPr>
+                </pic:pic>
+              </a:graphicData>
+            </a:graphic>
+          </wp:inline>
+        </w:drawing>
+      </w:r>
+    </w:p>
+    <w:p>
+      <w:pPr>
+        <w:pBdr>
+          <w:bottom w:val="single" w:sz="6" w:space="1" w:color="auto"/>
+        </w:pBdr>
+      </w:pPr>
+    </w:p>
+    <w:p>
+      <w:pPr>
+        <w:pBdr>
+          <w:bottom w:val="single" w:sz="6" w:space="1" w:color="auto"/>
+        </w:pBdr>
+      </w:pPr>
+    </w:p>
+    <w:p>
+      <w:pPr>
+        <w:pBdr>
+          <w:bottom w:val="single" w:sz="6" w:space="1" w:color="auto"/>
+        </w:pBdr>
+      </w:pPr>
+    </w:p>
+    <w:p>
+      <w:pPr>
+        <w:pBdr>
+          <w:bottom w:val="single" w:sz="6" w:space="1" w:color="auto"/>
+        </w:pBdr>
+      </w:pPr>
+    </w:p>
+    <w:p>
+      <w:pPr>
+        <w:pBdr>
+          <w:bottom w:val="single" w:sz="6" w:space="1" w:color="auto"/>
+        </w:pBdr>
+      </w:pPr>
+    </w:p>
+    <w:p>
+      <w:pPr>
+        <w:pBdr>
+          <w:bottom w:val="single" w:sz="6" w:space="1" w:color="auto"/>
+        </w:pBdr>
+      </w:pPr>
+    </w:p>
+    <w:p>
+      <w:pPr>
+        <w:pBdr>
+          <w:bottom w:val="single" w:sz="6" w:space="1" w:color="auto"/>
+        </w:pBdr>
+      </w:pPr>
+    </w:p>
+    <w:p>
+      <w:pPr>
+        <w:pBdr>
+          <w:bottom w:val="single" w:sz="6" w:space="1" w:color="auto"/>
+        </w:pBdr>
+      </w:pPr>
+    </w:p>
+    <w:p>
+      <w:pPr>
+        <w:pBdr>
+          <w:bottom w:val="single" w:sz="6" w:space="1" w:color="auto"/>
+        </w:pBdr>
+      </w:pPr>
+    </w:p>
+    <w:p>
+      <w:pPr>
+        <w:pBdr>
+          <w:bottom w:val="single" w:sz="6" w:space="1" w:color="auto"/>
+        </w:pBdr>
+      </w:pPr>
+    </w:p>
+    <w:p>
+      <w:pPr>
+        <w:pBdr>
+          <w:bottom w:val="single" w:sz="6" w:space="1" w:color="auto"/>
+        </w:pBdr>
+      </w:pPr>
+    </w:p>
+    <w:p>
+      <w:pPr>
+        <w:pBdr>
+          <w:bottom w:val="single" w:sz="6" w:space="1" w:color="auto"/>
+        </w:pBdr>
+      </w:pPr>
+    </w:p>
+    <w:p>
+      <w:pPr>
+        <w:pBdr>
+          <w:bottom w:val="single" w:sz="6" w:space="1" w:color="auto"/>
+        </w:pBdr>
       </w:pPr>
     </w:p>
     <w:p/>
@@ -3828,7 +5141,7 @@
   <w:abstractNum w:abstractNumId="0" w15:restartNumberingAfterBreak="0">
     <w:nsid w:val="18984780"/>
     <w:multiLevelType w:val="multilevel"/>
-    <w:tmpl w:val="8B20C28A"/>
+    <w:tmpl w:val="E4DA1CB2"/>
     <w:lvl w:ilvl="0">
       <w:start w:val="1"/>
       <w:numFmt w:val="bullet"/>
@@ -3877,23 +5190,19 @@
         <w:sz w:val="20"/>
       </w:rPr>
     </w:lvl>
-    <w:lvl w:ilvl="3" w:tentative="1">
+    <w:lvl w:ilvl="3">
       <w:start w:val="1"/>
-      <w:numFmt w:val="bullet"/>
-      <w:lvlText w:val=""/>
+      <w:numFmt w:val="decimal"/>
+      <w:lvlText w:val="%4."/>
       <w:lvlJc w:val="left"/>
       <w:pPr>
-        <w:tabs>
-          <w:tab w:val="num" w:pos="2880"/>
-        </w:tabs>
         <w:ind w:left="2880" w:hanging="360"/>
       </w:pPr>
       <w:rPr>
-        <w:rFonts w:ascii="Symbol" w:hAnsi="Symbol" w:hint="default"/>
-        <w:sz w:val="20"/>
+        <w:rFonts w:hint="default"/>
       </w:rPr>
     </w:lvl>
-    <w:lvl w:ilvl="4" w:tentative="1">
+    <w:lvl w:ilvl="4">
       <w:start w:val="1"/>
       <w:numFmt w:val="bullet"/>
       <w:lvlText w:val=""/>
@@ -4064,9 +5373,417 @@
     </w:lvl>
   </w:abstractNum>
   <w:abstractNum w:abstractNumId="2" w15:restartNumberingAfterBreak="0">
+    <w:nsid w:val="44DF5E16"/>
+    <w:multiLevelType w:val="multilevel"/>
+    <w:tmpl w:val="E4DA1CB2"/>
+    <w:styleLink w:val="Listaactual1"/>
+    <w:lvl w:ilvl="0">
+      <w:start w:val="1"/>
+      <w:numFmt w:val="bullet"/>
+      <w:lvlText w:val=""/>
+      <w:lvlJc w:val="left"/>
+      <w:pPr>
+        <w:tabs>
+          <w:tab w:val="num" w:pos="720"/>
+        </w:tabs>
+        <w:ind w:left="720" w:hanging="360"/>
+      </w:pPr>
+      <w:rPr>
+        <w:rFonts w:ascii="Symbol" w:hAnsi="Symbol" w:hint="default"/>
+        <w:sz w:val="20"/>
+      </w:rPr>
+    </w:lvl>
+    <w:lvl w:ilvl="1">
+      <w:start w:val="1"/>
+      <w:numFmt w:val="bullet"/>
+      <w:lvlText w:val=""/>
+      <w:lvlJc w:val="left"/>
+      <w:pPr>
+        <w:tabs>
+          <w:tab w:val="num" w:pos="1440"/>
+        </w:tabs>
+        <w:ind w:left="1440" w:hanging="360"/>
+      </w:pPr>
+      <w:rPr>
+        <w:rFonts w:ascii="Symbol" w:hAnsi="Symbol" w:hint="default"/>
+        <w:sz w:val="20"/>
+      </w:rPr>
+    </w:lvl>
+    <w:lvl w:ilvl="2">
+      <w:start w:val="1"/>
+      <w:numFmt w:val="bullet"/>
+      <w:lvlText w:val=""/>
+      <w:lvlJc w:val="left"/>
+      <w:pPr>
+        <w:tabs>
+          <w:tab w:val="num" w:pos="2160"/>
+        </w:tabs>
+        <w:ind w:left="2160" w:hanging="360"/>
+      </w:pPr>
+      <w:rPr>
+        <w:rFonts w:ascii="Symbol" w:hAnsi="Symbol" w:hint="default"/>
+        <w:sz w:val="20"/>
+      </w:rPr>
+    </w:lvl>
+    <w:lvl w:ilvl="3">
+      <w:start w:val="1"/>
+      <w:numFmt w:val="decimal"/>
+      <w:lvlText w:val="%4."/>
+      <w:lvlJc w:val="left"/>
+      <w:pPr>
+        <w:ind w:left="2880" w:hanging="360"/>
+      </w:pPr>
+      <w:rPr>
+        <w:rFonts w:hint="default"/>
+      </w:rPr>
+    </w:lvl>
+    <w:lvl w:ilvl="4">
+      <w:start w:val="1"/>
+      <w:numFmt w:val="bullet"/>
+      <w:lvlText w:val=""/>
+      <w:lvlJc w:val="left"/>
+      <w:pPr>
+        <w:tabs>
+          <w:tab w:val="num" w:pos="3600"/>
+        </w:tabs>
+        <w:ind w:left="3600" w:hanging="360"/>
+      </w:pPr>
+      <w:rPr>
+        <w:rFonts w:ascii="Symbol" w:hAnsi="Symbol" w:hint="default"/>
+        <w:sz w:val="20"/>
+      </w:rPr>
+    </w:lvl>
+    <w:lvl w:ilvl="5">
+      <w:start w:val="1"/>
+      <w:numFmt w:val="bullet"/>
+      <w:lvlText w:val=""/>
+      <w:lvlJc w:val="left"/>
+      <w:pPr>
+        <w:tabs>
+          <w:tab w:val="num" w:pos="4320"/>
+        </w:tabs>
+        <w:ind w:left="4320" w:hanging="360"/>
+      </w:pPr>
+      <w:rPr>
+        <w:rFonts w:ascii="Symbol" w:hAnsi="Symbol" w:hint="default"/>
+        <w:sz w:val="20"/>
+      </w:rPr>
+    </w:lvl>
+    <w:lvl w:ilvl="6">
+      <w:start w:val="1"/>
+      <w:numFmt w:val="bullet"/>
+      <w:lvlText w:val=""/>
+      <w:lvlJc w:val="left"/>
+      <w:pPr>
+        <w:tabs>
+          <w:tab w:val="num" w:pos="5040"/>
+        </w:tabs>
+        <w:ind w:left="5040" w:hanging="360"/>
+      </w:pPr>
+      <w:rPr>
+        <w:rFonts w:ascii="Symbol" w:hAnsi="Symbol" w:hint="default"/>
+        <w:sz w:val="20"/>
+      </w:rPr>
+    </w:lvl>
+    <w:lvl w:ilvl="7">
+      <w:start w:val="1"/>
+      <w:numFmt w:val="bullet"/>
+      <w:lvlText w:val=""/>
+      <w:lvlJc w:val="left"/>
+      <w:pPr>
+        <w:tabs>
+          <w:tab w:val="num" w:pos="5760"/>
+        </w:tabs>
+        <w:ind w:left="5760" w:hanging="360"/>
+      </w:pPr>
+      <w:rPr>
+        <w:rFonts w:ascii="Symbol" w:hAnsi="Symbol" w:hint="default"/>
+        <w:sz w:val="20"/>
+      </w:rPr>
+    </w:lvl>
+    <w:lvl w:ilvl="8">
+      <w:start w:val="1"/>
+      <w:numFmt w:val="bullet"/>
+      <w:lvlText w:val=""/>
+      <w:lvlJc w:val="left"/>
+      <w:pPr>
+        <w:tabs>
+          <w:tab w:val="num" w:pos="6480"/>
+        </w:tabs>
+        <w:ind w:left="6480" w:hanging="360"/>
+      </w:pPr>
+      <w:rPr>
+        <w:rFonts w:ascii="Symbol" w:hAnsi="Symbol" w:hint="default"/>
+        <w:sz w:val="20"/>
+      </w:rPr>
+    </w:lvl>
+  </w:abstractNum>
+  <w:abstractNum w:abstractNumId="3" w15:restartNumberingAfterBreak="0">
     <w:nsid w:val="4EB52D1F"/>
     <w:multiLevelType w:val="multilevel"/>
     <w:tmpl w:val="730AD6C6"/>
+    <w:lvl w:ilvl="0">
+      <w:start w:val="1"/>
+      <w:numFmt w:val="bullet"/>
+      <w:lvlText w:val=""/>
+      <w:lvlJc w:val="left"/>
+      <w:pPr>
+        <w:tabs>
+          <w:tab w:val="num" w:pos="720"/>
+        </w:tabs>
+        <w:ind w:left="720" w:hanging="360"/>
+      </w:pPr>
+      <w:rPr>
+        <w:rFonts w:ascii="Symbol" w:hAnsi="Symbol" w:hint="default"/>
+        <w:sz w:val="20"/>
+      </w:rPr>
+    </w:lvl>
+    <w:lvl w:ilvl="1">
+      <w:start w:val="1"/>
+      <w:numFmt w:val="bullet"/>
+      <w:lvlText w:val=""/>
+      <w:lvlJc w:val="left"/>
+      <w:pPr>
+        <w:tabs>
+          <w:tab w:val="num" w:pos="1440"/>
+        </w:tabs>
+        <w:ind w:left="1440" w:hanging="360"/>
+      </w:pPr>
+      <w:rPr>
+        <w:rFonts w:ascii="Symbol" w:hAnsi="Symbol" w:hint="default"/>
+        <w:sz w:val="20"/>
+      </w:rPr>
+    </w:lvl>
+    <w:lvl w:ilvl="2" w:tentative="1">
+      <w:start w:val="1"/>
+      <w:numFmt w:val="bullet"/>
+      <w:lvlText w:val=""/>
+      <w:lvlJc w:val="left"/>
+      <w:pPr>
+        <w:tabs>
+          <w:tab w:val="num" w:pos="2160"/>
+        </w:tabs>
+        <w:ind w:left="2160" w:hanging="360"/>
+      </w:pPr>
+      <w:rPr>
+        <w:rFonts w:ascii="Symbol" w:hAnsi="Symbol" w:hint="default"/>
+        <w:sz w:val="20"/>
+      </w:rPr>
+    </w:lvl>
+    <w:lvl w:ilvl="3" w:tentative="1">
+      <w:start w:val="1"/>
+      <w:numFmt w:val="bullet"/>
+      <w:lvlText w:val=""/>
+      <w:lvlJc w:val="left"/>
+      <w:pPr>
+        <w:tabs>
+          <w:tab w:val="num" w:pos="2880"/>
+        </w:tabs>
+        <w:ind w:left="2880" w:hanging="360"/>
+      </w:pPr>
+      <w:rPr>
+        <w:rFonts w:ascii="Symbol" w:hAnsi="Symbol" w:hint="default"/>
+        <w:sz w:val="20"/>
+      </w:rPr>
+    </w:lvl>
+    <w:lvl w:ilvl="4" w:tentative="1">
+      <w:start w:val="1"/>
+      <w:numFmt w:val="bullet"/>
+      <w:lvlText w:val=""/>
+      <w:lvlJc w:val="left"/>
+      <w:pPr>
+        <w:tabs>
+          <w:tab w:val="num" w:pos="3600"/>
+        </w:tabs>
+        <w:ind w:left="3600" w:hanging="360"/>
+      </w:pPr>
+      <w:rPr>
+        <w:rFonts w:ascii="Symbol" w:hAnsi="Symbol" w:hint="default"/>
+        <w:sz w:val="20"/>
+      </w:rPr>
+    </w:lvl>
+    <w:lvl w:ilvl="5" w:tentative="1">
+      <w:start w:val="1"/>
+      <w:numFmt w:val="bullet"/>
+      <w:lvlText w:val=""/>
+      <w:lvlJc w:val="left"/>
+      <w:pPr>
+        <w:tabs>
+          <w:tab w:val="num" w:pos="4320"/>
+        </w:tabs>
+        <w:ind w:left="4320" w:hanging="360"/>
+      </w:pPr>
+      <w:rPr>
+        <w:rFonts w:ascii="Symbol" w:hAnsi="Symbol" w:hint="default"/>
+        <w:sz w:val="20"/>
+      </w:rPr>
+    </w:lvl>
+    <w:lvl w:ilvl="6" w:tentative="1">
+      <w:start w:val="1"/>
+      <w:numFmt w:val="bullet"/>
+      <w:lvlText w:val=""/>
+      <w:lvlJc w:val="left"/>
+      <w:pPr>
+        <w:tabs>
+          <w:tab w:val="num" w:pos="5040"/>
+        </w:tabs>
+        <w:ind w:left="5040" w:hanging="360"/>
+      </w:pPr>
+      <w:rPr>
+        <w:rFonts w:ascii="Symbol" w:hAnsi="Symbol" w:hint="default"/>
+        <w:sz w:val="20"/>
+      </w:rPr>
+    </w:lvl>
+    <w:lvl w:ilvl="7" w:tentative="1">
+      <w:start w:val="1"/>
+      <w:numFmt w:val="bullet"/>
+      <w:lvlText w:val=""/>
+      <w:lvlJc w:val="left"/>
+      <w:pPr>
+        <w:tabs>
+          <w:tab w:val="num" w:pos="5760"/>
+        </w:tabs>
+        <w:ind w:left="5760" w:hanging="360"/>
+      </w:pPr>
+      <w:rPr>
+        <w:rFonts w:ascii="Symbol" w:hAnsi="Symbol" w:hint="default"/>
+        <w:sz w:val="20"/>
+      </w:rPr>
+    </w:lvl>
+    <w:lvl w:ilvl="8" w:tentative="1">
+      <w:start w:val="1"/>
+      <w:numFmt w:val="bullet"/>
+      <w:lvlText w:val=""/>
+      <w:lvlJc w:val="left"/>
+      <w:pPr>
+        <w:tabs>
+          <w:tab w:val="num" w:pos="6480"/>
+        </w:tabs>
+        <w:ind w:left="6480" w:hanging="360"/>
+      </w:pPr>
+      <w:rPr>
+        <w:rFonts w:ascii="Symbol" w:hAnsi="Symbol" w:hint="default"/>
+        <w:sz w:val="20"/>
+      </w:rPr>
+    </w:lvl>
+  </w:abstractNum>
+  <w:abstractNum w:abstractNumId="4" w15:restartNumberingAfterBreak="0">
+    <w:nsid w:val="53006D62"/>
+    <w:multiLevelType w:val="multilevel"/>
+    <w:tmpl w:val="23CCD0FE"/>
+    <w:lvl w:ilvl="0">
+      <w:start w:val="1"/>
+      <w:numFmt w:val="decimal"/>
+      <w:lvlText w:val="%1"/>
+      <w:lvlJc w:val="left"/>
+      <w:pPr>
+        <w:ind w:left="372" w:hanging="372"/>
+      </w:pPr>
+      <w:rPr>
+        <w:rFonts w:hint="default"/>
+      </w:rPr>
+    </w:lvl>
+    <w:lvl w:ilvl="1">
+      <w:start w:val="1"/>
+      <w:numFmt w:val="decimal"/>
+      <w:lvlText w:val="%1.%2"/>
+      <w:lvlJc w:val="left"/>
+      <w:pPr>
+        <w:ind w:left="372" w:hanging="372"/>
+      </w:pPr>
+      <w:rPr>
+        <w:rFonts w:hint="default"/>
+      </w:rPr>
+    </w:lvl>
+    <w:lvl w:ilvl="2">
+      <w:start w:val="1"/>
+      <w:numFmt w:val="decimal"/>
+      <w:lvlText w:val="%1.%2.%3"/>
+      <w:lvlJc w:val="left"/>
+      <w:pPr>
+        <w:ind w:left="720" w:hanging="720"/>
+      </w:pPr>
+      <w:rPr>
+        <w:rFonts w:hint="default"/>
+      </w:rPr>
+    </w:lvl>
+    <w:lvl w:ilvl="3">
+      <w:start w:val="1"/>
+      <w:numFmt w:val="decimal"/>
+      <w:lvlText w:val="%1.%2.%3.%4"/>
+      <w:lvlJc w:val="left"/>
+      <w:pPr>
+        <w:ind w:left="1080" w:hanging="1080"/>
+      </w:pPr>
+      <w:rPr>
+        <w:rFonts w:hint="default"/>
+      </w:rPr>
+    </w:lvl>
+    <w:lvl w:ilvl="4">
+      <w:start w:val="1"/>
+      <w:numFmt w:val="decimal"/>
+      <w:lvlText w:val="%1.%2.%3.%4.%5"/>
+      <w:lvlJc w:val="left"/>
+      <w:pPr>
+        <w:ind w:left="1080" w:hanging="1080"/>
+      </w:pPr>
+      <w:rPr>
+        <w:rFonts w:hint="default"/>
+      </w:rPr>
+    </w:lvl>
+    <w:lvl w:ilvl="5">
+      <w:start w:val="1"/>
+      <w:numFmt w:val="decimal"/>
+      <w:lvlText w:val="%1.%2.%3.%4.%5.%6"/>
+      <w:lvlJc w:val="left"/>
+      <w:pPr>
+        <w:ind w:left="1440" w:hanging="1440"/>
+      </w:pPr>
+      <w:rPr>
+        <w:rFonts w:hint="default"/>
+      </w:rPr>
+    </w:lvl>
+    <w:lvl w:ilvl="6">
+      <w:start w:val="1"/>
+      <w:numFmt w:val="decimal"/>
+      <w:lvlText w:val="%1.%2.%3.%4.%5.%6.%7"/>
+      <w:lvlJc w:val="left"/>
+      <w:pPr>
+        <w:ind w:left="1440" w:hanging="1440"/>
+      </w:pPr>
+      <w:rPr>
+        <w:rFonts w:hint="default"/>
+      </w:rPr>
+    </w:lvl>
+    <w:lvl w:ilvl="7">
+      <w:start w:val="1"/>
+      <w:numFmt w:val="decimal"/>
+      <w:lvlText w:val="%1.%2.%3.%4.%5.%6.%7.%8"/>
+      <w:lvlJc w:val="left"/>
+      <w:pPr>
+        <w:ind w:left="1800" w:hanging="1800"/>
+      </w:pPr>
+      <w:rPr>
+        <w:rFonts w:hint="default"/>
+      </w:rPr>
+    </w:lvl>
+    <w:lvl w:ilvl="8">
+      <w:start w:val="1"/>
+      <w:numFmt w:val="decimal"/>
+      <w:lvlText w:val="%1.%2.%3.%4.%5.%6.%7.%8.%9"/>
+      <w:lvlJc w:val="left"/>
+      <w:pPr>
+        <w:ind w:left="1800" w:hanging="1800"/>
+      </w:pPr>
+      <w:rPr>
+        <w:rFonts w:hint="default"/>
+      </w:rPr>
+    </w:lvl>
+  </w:abstractNum>
+  <w:abstractNum w:abstractNumId="5" w15:restartNumberingAfterBreak="0">
+    <w:nsid w:val="636740D5"/>
+    <w:multiLevelType w:val="multilevel"/>
+    <w:tmpl w:val="FE38624C"/>
     <w:lvl w:ilvl="0">
       <w:start w:val="1"/>
       <w:numFmt w:val="bullet"/>
@@ -4212,156 +5929,7 @@
       </w:rPr>
     </w:lvl>
   </w:abstractNum>
-  <w:abstractNum w:abstractNumId="3" w15:restartNumberingAfterBreak="0">
-    <w:nsid w:val="636740D5"/>
-    <w:multiLevelType w:val="multilevel"/>
-    <w:tmpl w:val="FE38624C"/>
-    <w:lvl w:ilvl="0">
-      <w:start w:val="1"/>
-      <w:numFmt w:val="bullet"/>
-      <w:lvlText w:val=""/>
-      <w:lvlJc w:val="left"/>
-      <w:pPr>
-        <w:tabs>
-          <w:tab w:val="num" w:pos="720"/>
-        </w:tabs>
-        <w:ind w:left="720" w:hanging="360"/>
-      </w:pPr>
-      <w:rPr>
-        <w:rFonts w:ascii="Symbol" w:hAnsi="Symbol" w:hint="default"/>
-        <w:sz w:val="20"/>
-      </w:rPr>
-    </w:lvl>
-    <w:lvl w:ilvl="1" w:tentative="1">
-      <w:start w:val="1"/>
-      <w:numFmt w:val="bullet"/>
-      <w:lvlText w:val=""/>
-      <w:lvlJc w:val="left"/>
-      <w:pPr>
-        <w:tabs>
-          <w:tab w:val="num" w:pos="1440"/>
-        </w:tabs>
-        <w:ind w:left="1440" w:hanging="360"/>
-      </w:pPr>
-      <w:rPr>
-        <w:rFonts w:ascii="Symbol" w:hAnsi="Symbol" w:hint="default"/>
-        <w:sz w:val="20"/>
-      </w:rPr>
-    </w:lvl>
-    <w:lvl w:ilvl="2" w:tentative="1">
-      <w:start w:val="1"/>
-      <w:numFmt w:val="bullet"/>
-      <w:lvlText w:val=""/>
-      <w:lvlJc w:val="left"/>
-      <w:pPr>
-        <w:tabs>
-          <w:tab w:val="num" w:pos="2160"/>
-        </w:tabs>
-        <w:ind w:left="2160" w:hanging="360"/>
-      </w:pPr>
-      <w:rPr>
-        <w:rFonts w:ascii="Symbol" w:hAnsi="Symbol" w:hint="default"/>
-        <w:sz w:val="20"/>
-      </w:rPr>
-    </w:lvl>
-    <w:lvl w:ilvl="3" w:tentative="1">
-      <w:start w:val="1"/>
-      <w:numFmt w:val="bullet"/>
-      <w:lvlText w:val=""/>
-      <w:lvlJc w:val="left"/>
-      <w:pPr>
-        <w:tabs>
-          <w:tab w:val="num" w:pos="2880"/>
-        </w:tabs>
-        <w:ind w:left="2880" w:hanging="360"/>
-      </w:pPr>
-      <w:rPr>
-        <w:rFonts w:ascii="Symbol" w:hAnsi="Symbol" w:hint="default"/>
-        <w:sz w:val="20"/>
-      </w:rPr>
-    </w:lvl>
-    <w:lvl w:ilvl="4" w:tentative="1">
-      <w:start w:val="1"/>
-      <w:numFmt w:val="bullet"/>
-      <w:lvlText w:val=""/>
-      <w:lvlJc w:val="left"/>
-      <w:pPr>
-        <w:tabs>
-          <w:tab w:val="num" w:pos="3600"/>
-        </w:tabs>
-        <w:ind w:left="3600" w:hanging="360"/>
-      </w:pPr>
-      <w:rPr>
-        <w:rFonts w:ascii="Symbol" w:hAnsi="Symbol" w:hint="default"/>
-        <w:sz w:val="20"/>
-      </w:rPr>
-    </w:lvl>
-    <w:lvl w:ilvl="5" w:tentative="1">
-      <w:start w:val="1"/>
-      <w:numFmt w:val="bullet"/>
-      <w:lvlText w:val=""/>
-      <w:lvlJc w:val="left"/>
-      <w:pPr>
-        <w:tabs>
-          <w:tab w:val="num" w:pos="4320"/>
-        </w:tabs>
-        <w:ind w:left="4320" w:hanging="360"/>
-      </w:pPr>
-      <w:rPr>
-        <w:rFonts w:ascii="Symbol" w:hAnsi="Symbol" w:hint="default"/>
-        <w:sz w:val="20"/>
-      </w:rPr>
-    </w:lvl>
-    <w:lvl w:ilvl="6" w:tentative="1">
-      <w:start w:val="1"/>
-      <w:numFmt w:val="bullet"/>
-      <w:lvlText w:val=""/>
-      <w:lvlJc w:val="left"/>
-      <w:pPr>
-        <w:tabs>
-          <w:tab w:val="num" w:pos="5040"/>
-        </w:tabs>
-        <w:ind w:left="5040" w:hanging="360"/>
-      </w:pPr>
-      <w:rPr>
-        <w:rFonts w:ascii="Symbol" w:hAnsi="Symbol" w:hint="default"/>
-        <w:sz w:val="20"/>
-      </w:rPr>
-    </w:lvl>
-    <w:lvl w:ilvl="7" w:tentative="1">
-      <w:start w:val="1"/>
-      <w:numFmt w:val="bullet"/>
-      <w:lvlText w:val=""/>
-      <w:lvlJc w:val="left"/>
-      <w:pPr>
-        <w:tabs>
-          <w:tab w:val="num" w:pos="5760"/>
-        </w:tabs>
-        <w:ind w:left="5760" w:hanging="360"/>
-      </w:pPr>
-      <w:rPr>
-        <w:rFonts w:ascii="Symbol" w:hAnsi="Symbol" w:hint="default"/>
-        <w:sz w:val="20"/>
-      </w:rPr>
-    </w:lvl>
-    <w:lvl w:ilvl="8" w:tentative="1">
-      <w:start w:val="1"/>
-      <w:numFmt w:val="bullet"/>
-      <w:lvlText w:val=""/>
-      <w:lvlJc w:val="left"/>
-      <w:pPr>
-        <w:tabs>
-          <w:tab w:val="num" w:pos="6480"/>
-        </w:tabs>
-        <w:ind w:left="6480" w:hanging="360"/>
-      </w:pPr>
-      <w:rPr>
-        <w:rFonts w:ascii="Symbol" w:hAnsi="Symbol" w:hint="default"/>
-        <w:sz w:val="20"/>
-      </w:rPr>
-    </w:lvl>
-  </w:abstractNum>
-  <w:abstractNum w:abstractNumId="4" w15:restartNumberingAfterBreak="0">
+  <w:abstractNum w:abstractNumId="6" w15:restartNumberingAfterBreak="0">
     <w:nsid w:val="7A155154"/>
     <w:multiLevelType w:val="hybridMultilevel"/>
     <w:tmpl w:val="02F0FFCE"/>
@@ -4474,7 +6042,7 @@
       </w:rPr>
     </w:lvl>
   </w:abstractNum>
-  <w:abstractNum w:abstractNumId="5" w15:restartNumberingAfterBreak="0">
+  <w:abstractNum w:abstractNumId="7" w15:restartNumberingAfterBreak="0">
     <w:nsid w:val="7B750BCD"/>
     <w:multiLevelType w:val="hybridMultilevel"/>
     <w:tmpl w:val="25488C1C"/>
@@ -4587,22 +6155,28 @@
     </w:lvl>
   </w:abstractNum>
   <w:num w:numId="1" w16cid:durableId="1341930320">
-    <w:abstractNumId w:val="5"/>
+    <w:abstractNumId w:val="7"/>
   </w:num>
   <w:num w:numId="2" w16cid:durableId="39213036">
     <w:abstractNumId w:val="1"/>
   </w:num>
   <w:num w:numId="3" w16cid:durableId="1838496810">
-    <w:abstractNumId w:val="4"/>
+    <w:abstractNumId w:val="6"/>
   </w:num>
   <w:num w:numId="4" w16cid:durableId="1719813210">
     <w:abstractNumId w:val="0"/>
   </w:num>
   <w:num w:numId="5" w16cid:durableId="1157570246">
+    <w:abstractNumId w:val="5"/>
+  </w:num>
+  <w:num w:numId="6" w16cid:durableId="2070222233">
     <w:abstractNumId w:val="3"/>
   </w:num>
-  <w:num w:numId="6" w16cid:durableId="2070222233">
+  <w:num w:numId="7" w16cid:durableId="1001355461">
     <w:abstractNumId w:val="2"/>
+  </w:num>
+  <w:num w:numId="8" w16cid:durableId="513231712">
+    <w:abstractNumId w:val="4"/>
   </w:num>
 </w:numbering>
 </file>
@@ -5648,6 +7222,39 @@
     <w:uiPriority w:val="99"/>
     <w:rsid w:val="00B65DFB"/>
   </w:style>
+  <w:style w:type="character" w:styleId="Hipervnculo">
+    <w:name w:val="Hyperlink"/>
+    <w:basedOn w:val="Fuentedeprrafopredeter"/>
+    <w:uiPriority w:val="99"/>
+    <w:unhideWhenUsed/>
+    <w:rsid w:val="0032240B"/>
+    <w:rPr>
+      <w:color w:val="467886" w:themeColor="hyperlink"/>
+      <w:u w:val="single"/>
+    </w:rPr>
+  </w:style>
+  <w:style w:type="character" w:styleId="Mencinsinresolver">
+    <w:name w:val="Unresolved Mention"/>
+    <w:basedOn w:val="Fuentedeprrafopredeter"/>
+    <w:uiPriority w:val="99"/>
+    <w:semiHidden/>
+    <w:unhideWhenUsed/>
+    <w:rsid w:val="0032240B"/>
+    <w:rPr>
+      <w:color w:val="605E5C"/>
+      <w:shd w:val="clear" w:color="auto" w:fill="E1DFDD"/>
+    </w:rPr>
+  </w:style>
+  <w:style w:type="numbering" w:customStyle="1" w:styleId="Listaactual1">
+    <w:name w:val="Lista actual1"/>
+    <w:uiPriority w:val="99"/>
+    <w:rsid w:val="00D77AAC"/>
+    <w:pPr>
+      <w:numPr>
+        <w:numId w:val="7"/>
+      </w:numPr>
+    </w:pPr>
+  </w:style>
 </w:styles>
 </file>
 

</xml_diff>

<commit_message>
ROS2 implementation on AUTONOMOUS MOBILE ROBOT
</commit_message>
<xml_diff>
--- a/roboticDevelopEnv/work/ros2Notes.docx
+++ b/roboticDevelopEnv/work/ros2Notes.docx
@@ -4963,12 +4963,9 @@
         <w:jc w:val="center"/>
       </w:pPr>
       <w:r>
-        <w:t>CUSTOM MSG AND SRV FILES</w:t>
-      </w:r>
-    </w:p>
-    <w:p/>
-    <w:p/>
-    <w:p/>
+        <w:t>CUSTOM MSG AND SRV FILE</w:t>
+      </w:r>
+    </w:p>
     <w:p>
       <w:pPr>
         <w:pBdr>
@@ -4983,11 +4980,6 @@
       <w:r>
         <w:t>CUSTOM INTERFACES</w:t>
       </w:r>
-    </w:p>
-    <w:p>
-      <w:pPr>
-        <w:jc w:val="center"/>
-      </w:pPr>
     </w:p>
     <w:p>
       <w:pPr>
@@ -4997,16 +4989,7 @@
         <w:jc w:val="center"/>
       </w:pPr>
     </w:p>
-    <w:p>
-      <w:pPr>
-        <w:jc w:val="center"/>
-      </w:pPr>
-    </w:p>
-    <w:p>
-      <w:pPr>
-        <w:jc w:val="center"/>
-      </w:pPr>
-    </w:p>
+    <w:p/>
     <w:p>
       <w:pPr>
         <w:pBdr>
@@ -5017,6 +5000,9 @@
       <w:r>
         <w:t xml:space="preserve">PARAMETERS </w:t>
       </w:r>
+      <w:r>
+        <w:t>on CLASS</w:t>
+      </w:r>
     </w:p>
     <w:p>
       <w:pPr>
@@ -5035,6 +5021,17 @@
       <w:pPr>
         <w:jc w:val="center"/>
       </w:pPr>
+      <w:r>
+        <w:t xml:space="preserve">Ros2 doctor </w:t>
+      </w:r>
+      <w:proofErr w:type="gramStart"/>
+      <w:r>
+        <w:t>command :</w:t>
+      </w:r>
+      <w:proofErr w:type="gramEnd"/>
+      <w:r>
+        <w:t xml:space="preserve"> </w:t>
+      </w:r>
     </w:p>
     <w:p>
       <w:pPr>
@@ -5045,11 +5042,51 @@
       <w:pPr>
         <w:jc w:val="center"/>
       </w:pPr>
+      <w:r>
+        <w:drawing>
+          <wp:inline distT="0" distB="0" distL="0" distR="0" wp14:anchorId="30BBBBA5" wp14:editId="6102AD07">
+            <wp:extent cx="5731510" cy="3023870"/>
+            <wp:effectExtent l="0" t="0" r="2540" b="5080"/>
+            <wp:docPr id="618049698" name="Imagen 1"/>
+            <wp:cNvGraphicFramePr>
+              <a:graphicFrameLocks xmlns:a="http://schemas.openxmlformats.org/drawingml/2006/main" noChangeAspect="1"/>
+            </wp:cNvGraphicFramePr>
+            <a:graphic xmlns:a="http://schemas.openxmlformats.org/drawingml/2006/main">
+              <a:graphicData uri="http://schemas.openxmlformats.org/drawingml/2006/picture">
+                <pic:pic xmlns:pic="http://schemas.openxmlformats.org/drawingml/2006/picture">
+                  <pic:nvPicPr>
+                    <pic:cNvPr id="618049698" name=""/>
+                    <pic:cNvPicPr/>
+                  </pic:nvPicPr>
+                  <pic:blipFill>
+                    <a:blip r:embed="rId59"/>
+                    <a:stretch>
+                      <a:fillRect/>
+                    </a:stretch>
+                  </pic:blipFill>
+                  <pic:spPr>
+                    <a:xfrm>
+                      <a:off x="0" y="0"/>
+                      <a:ext cx="5731510" cy="3023870"/>
+                    </a:xfrm>
+                    <a:prstGeom prst="rect">
+                      <a:avLst/>
+                    </a:prstGeom>
+                  </pic:spPr>
+                </pic:pic>
+              </a:graphicData>
+            </a:graphic>
+          </wp:inline>
+        </w:drawing>
+      </w:r>
     </w:p>
     <w:p>
       <w:pPr>
         <w:jc w:val="center"/>
       </w:pPr>
+      <w:r>
+        <w:t>This will conduct checks over all setup modules and return warnings and errors.</w:t>
+      </w:r>
     </w:p>
     <w:p>
       <w:pPr>
@@ -5057,7 +5094,20 @@
       </w:pPr>
     </w:p>
     <w:p>
-      <w:pPr>
+      <w:r>
+        <w:t>2. CHECK A SYSTEM</w:t>
+      </w:r>
+    </w:p>
+    <w:p>
+      <w:r>
+        <w:t xml:space="preserve">3. DOING A FULL REPORT </w:t>
+      </w:r>
+    </w:p>
+    <w:p>
+      <w:pPr>
+        <w:pBdr>
+          <w:bottom w:val="single" w:sz="6" w:space="1" w:color="auto"/>
+        </w:pBdr>
         <w:jc w:val="center"/>
       </w:pPr>
     </w:p>
@@ -5065,12 +5115,1382 @@
       <w:pPr>
         <w:jc w:val="center"/>
       </w:pPr>
+      <w:r>
+        <w:lastRenderedPageBreak/>
+        <w:t xml:space="preserve">IMPLEMENTING ROS2 ON AUTONOMOUS ROBOT NAVIGATION </w:t>
+      </w:r>
     </w:p>
     <w:p>
       <w:pPr>
         <w:jc w:val="center"/>
       </w:pPr>
     </w:p>
+    <w:p>
+      <w:pPr>
+        <w:pStyle w:val="Prrafodelista"/>
+        <w:numPr>
+          <w:ilvl w:val="3"/>
+          <w:numId w:val="4"/>
+        </w:numPr>
+      </w:pPr>
+      <w:r>
+        <w:t xml:space="preserve">PUB SUBS </w:t>
+      </w:r>
+    </w:p>
+    <w:p>
+      <w:pPr>
+        <w:pStyle w:val="Prrafodelista"/>
+        <w:numPr>
+          <w:ilvl w:val="2"/>
+          <w:numId w:val="4"/>
+        </w:numPr>
+        <w:rPr>
+          <w:lang w:val="es-ES"/>
+        </w:rPr>
+      </w:pPr>
+      <w:r>
+        <w:rPr>
+          <w:lang w:val="es-ES"/>
+        </w:rPr>
+        <w:t xml:space="preserve">Para </w:t>
+      </w:r>
+      <w:proofErr w:type="spellStart"/>
+      <w:r>
+        <w:rPr>
+          <w:lang w:val="es-ES"/>
+        </w:rPr>
+        <w:t>transmission</w:t>
+      </w:r>
+      <w:proofErr w:type="spellEnd"/>
+      <w:r>
+        <w:rPr>
+          <w:lang w:val="es-ES"/>
+        </w:rPr>
+        <w:t xml:space="preserve"> continua de da</w:t>
+      </w:r>
+      <w:r>
+        <w:rPr>
+          <w:lang w:val="es-ES"/>
+        </w:rPr>
+        <w:t>tos</w:t>
+      </w:r>
+    </w:p>
+    <w:tbl>
+      <w:tblPr>
+        <w:tblW w:w="0" w:type="auto"/>
+        <w:tblCellSpacing w:w="15" w:type="dxa"/>
+        <w:tblCellMar>
+          <w:top w:w="15" w:type="dxa"/>
+          <w:left w:w="15" w:type="dxa"/>
+          <w:bottom w:w="15" w:type="dxa"/>
+          <w:right w:w="15" w:type="dxa"/>
+        </w:tblCellMar>
+        <w:tblLook w:val="04A0" w:firstRow="1" w:lastRow="0" w:firstColumn="1" w:lastColumn="0" w:noHBand="0" w:noVBand="1"/>
+      </w:tblPr>
+      <w:tblGrid>
+        <w:gridCol w:w="3106"/>
+        <w:gridCol w:w="2784"/>
+        <w:gridCol w:w="3136"/>
+      </w:tblGrid>
+      <w:tr>
+        <w:trPr>
+          <w:tblHeader/>
+          <w:tblCellSpacing w:w="15" w:type="dxa"/>
+        </w:trPr>
+        <w:tc>
+          <w:tcPr>
+            <w:tcW w:w="0" w:type="auto"/>
+            <w:vAlign w:val="center"/>
+            <w:hideMark/>
+          </w:tcPr>
+          <w:p>
+            <w:pPr>
+              <w:rPr>
+                <w:b/>
+                <w:bCs/>
+              </w:rPr>
+            </w:pPr>
+            <w:proofErr w:type="spellStart"/>
+            <w:r>
+              <w:rPr>
+                <w:b/>
+                <w:bCs/>
+              </w:rPr>
+              <w:t>Publicador</w:t>
+            </w:r>
+            <w:proofErr w:type="spellEnd"/>
+            <w:r>
+              <w:rPr>
+                <w:b/>
+                <w:bCs/>
+              </w:rPr>
+              <w:t xml:space="preserve"> (Publisher)</w:t>
+            </w:r>
+          </w:p>
+        </w:tc>
+        <w:tc>
+          <w:tcPr>
+            <w:tcW w:w="0" w:type="auto"/>
+            <w:vAlign w:val="center"/>
+            <w:hideMark/>
+          </w:tcPr>
+          <w:p>
+            <w:pPr>
+              <w:rPr>
+                <w:b/>
+                <w:bCs/>
+              </w:rPr>
+            </w:pPr>
+            <w:proofErr w:type="spellStart"/>
+            <w:r>
+              <w:rPr>
+                <w:b/>
+                <w:bCs/>
+              </w:rPr>
+              <w:t>Suscriptor</w:t>
+            </w:r>
+            <w:proofErr w:type="spellEnd"/>
+            <w:r>
+              <w:rPr>
+                <w:b/>
+                <w:bCs/>
+              </w:rPr>
+              <w:t xml:space="preserve"> (Subscriber)</w:t>
+            </w:r>
+          </w:p>
+        </w:tc>
+        <w:tc>
+          <w:tcPr>
+            <w:tcW w:w="0" w:type="auto"/>
+            <w:vAlign w:val="center"/>
+            <w:hideMark/>
+          </w:tcPr>
+          <w:p>
+            <w:pPr>
+              <w:rPr>
+                <w:b/>
+                <w:bCs/>
+              </w:rPr>
+            </w:pPr>
+            <w:proofErr w:type="spellStart"/>
+            <w:r>
+              <w:rPr>
+                <w:b/>
+                <w:bCs/>
+              </w:rPr>
+              <w:t>Ejemplo</w:t>
+            </w:r>
+            <w:proofErr w:type="spellEnd"/>
+            <w:r>
+              <w:rPr>
+                <w:b/>
+                <w:bCs/>
+              </w:rPr>
+              <w:t xml:space="preserve"> </w:t>
+            </w:r>
+            <w:proofErr w:type="spellStart"/>
+            <w:r>
+              <w:rPr>
+                <w:b/>
+                <w:bCs/>
+              </w:rPr>
+              <w:t>en</w:t>
+            </w:r>
+            <w:proofErr w:type="spellEnd"/>
+            <w:r>
+              <w:rPr>
+                <w:b/>
+                <w:bCs/>
+              </w:rPr>
+              <w:t xml:space="preserve"> robot</w:t>
+            </w:r>
+          </w:p>
+        </w:tc>
+      </w:tr>
+      <w:tr>
+        <w:trPr>
+          <w:tblCellSpacing w:w="15" w:type="dxa"/>
+        </w:trPr>
+        <w:tc>
+          <w:tcPr>
+            <w:tcW w:w="0" w:type="auto"/>
+            <w:vAlign w:val="center"/>
+            <w:hideMark/>
+          </w:tcPr>
+          <w:p>
+            <w:proofErr w:type="spellStart"/>
+            <w:r>
+              <w:t>Nodo</w:t>
+            </w:r>
+            <w:proofErr w:type="spellEnd"/>
+            <w:r>
+              <w:t xml:space="preserve"> que </w:t>
+            </w:r>
+            <w:proofErr w:type="spellStart"/>
+            <w:r>
+              <w:t>emite</w:t>
+            </w:r>
+            <w:proofErr w:type="spellEnd"/>
+            <w:r>
+              <w:t xml:space="preserve"> </w:t>
+            </w:r>
+            <w:proofErr w:type="spellStart"/>
+            <w:r>
+              <w:t>datos</w:t>
+            </w:r>
+            <w:proofErr w:type="spellEnd"/>
+          </w:p>
+        </w:tc>
+        <w:tc>
+          <w:tcPr>
+            <w:tcW w:w="0" w:type="auto"/>
+            <w:vAlign w:val="center"/>
+            <w:hideMark/>
+          </w:tcPr>
+          <w:p>
+            <w:proofErr w:type="spellStart"/>
+            <w:r>
+              <w:t>Nodo</w:t>
+            </w:r>
+            <w:proofErr w:type="spellEnd"/>
+            <w:r>
+              <w:t xml:space="preserve"> que </w:t>
+            </w:r>
+            <w:proofErr w:type="spellStart"/>
+            <w:r>
+              <w:t>escucha</w:t>
+            </w:r>
+            <w:proofErr w:type="spellEnd"/>
+            <w:r>
+              <w:t xml:space="preserve"> </w:t>
+            </w:r>
+            <w:proofErr w:type="spellStart"/>
+            <w:r>
+              <w:t>datos</w:t>
+            </w:r>
+            <w:proofErr w:type="spellEnd"/>
+          </w:p>
+        </w:tc>
+        <w:tc>
+          <w:tcPr>
+            <w:tcW w:w="0" w:type="auto"/>
+            <w:vAlign w:val="center"/>
+            <w:hideMark/>
+          </w:tcPr>
+          <w:p>
+            <w:r>
+              <w:t xml:space="preserve">IMU → </w:t>
+            </w:r>
+            <w:proofErr w:type="spellStart"/>
+            <w:r>
+              <w:t>Nodo</w:t>
+            </w:r>
+            <w:proofErr w:type="spellEnd"/>
+            <w:r>
+              <w:t xml:space="preserve"> de </w:t>
+            </w:r>
+            <w:proofErr w:type="spellStart"/>
+            <w:r>
+              <w:t>navegación</w:t>
+            </w:r>
+            <w:proofErr w:type="spellEnd"/>
+          </w:p>
+        </w:tc>
+      </w:tr>
+      <w:tr>
+        <w:trPr>
+          <w:tblCellSpacing w:w="15" w:type="dxa"/>
+        </w:trPr>
+        <w:tc>
+          <w:tcPr>
+            <w:tcW w:w="0" w:type="auto"/>
+            <w:vAlign w:val="center"/>
+            <w:hideMark/>
+          </w:tcPr>
+          <w:p>
+            <w:pPr>
+              <w:rPr>
+                <w:lang w:val="es-ES"/>
+              </w:rPr>
+            </w:pPr>
+            <w:r>
+              <w:rPr>
+                <w:lang w:val="es-ES"/>
+              </w:rPr>
+              <w:t>Se usa para sensores, telemetría, comandos periódicos</w:t>
+            </w:r>
+          </w:p>
+        </w:tc>
+        <w:tc>
+          <w:tcPr>
+            <w:tcW w:w="0" w:type="auto"/>
+            <w:vAlign w:val="center"/>
+            <w:hideMark/>
+          </w:tcPr>
+          <w:p>
+            <w:pPr>
+              <w:rPr>
+                <w:lang w:val="es-ES"/>
+              </w:rPr>
+            </w:pPr>
+            <w:r>
+              <w:rPr>
+                <w:lang w:val="es-ES"/>
+              </w:rPr>
+              <w:t>Toma decisiones o actúa en base a esos datos</w:t>
+            </w:r>
+          </w:p>
+        </w:tc>
+        <w:tc>
+          <w:tcPr>
+            <w:tcW w:w="0" w:type="auto"/>
+            <w:vAlign w:val="center"/>
+            <w:hideMark/>
+          </w:tcPr>
+          <w:p>
+            <w:pPr>
+              <w:rPr>
+                <w:lang w:val="es-ES"/>
+              </w:rPr>
+            </w:pPr>
+            <w:r>
+              <w:rPr>
+                <w:lang w:val="es-ES"/>
+              </w:rPr>
+              <w:t>Sensores publican posición, otro nodo decide qué hacer</w:t>
+            </w:r>
+          </w:p>
+        </w:tc>
+      </w:tr>
+    </w:tbl>
+    <w:p>
+      <w:pPr>
+        <w:rPr>
+          <w:lang w:val="es-ES"/>
+        </w:rPr>
+      </w:pPr>
+    </w:p>
+    <w:p>
+      <w:r>
+        <w:rPr>
+          <w:b/>
+          <w:bCs/>
+        </w:rPr>
+        <w:t xml:space="preserve">En </w:t>
+      </w:r>
+      <w:proofErr w:type="spellStart"/>
+      <w:r>
+        <w:rPr>
+          <w:b/>
+          <w:bCs/>
+        </w:rPr>
+        <w:t>el</w:t>
+      </w:r>
+      <w:proofErr w:type="spellEnd"/>
+      <w:r>
+        <w:rPr>
+          <w:b/>
+          <w:bCs/>
+        </w:rPr>
+        <w:t xml:space="preserve"> </w:t>
+      </w:r>
+      <w:proofErr w:type="gramStart"/>
+      <w:r>
+        <w:rPr>
+          <w:b/>
+          <w:bCs/>
+        </w:rPr>
+        <w:t>Proyecto :</w:t>
+      </w:r>
+      <w:proofErr w:type="gramEnd"/>
+      <w:r>
+        <w:rPr>
+          <w:b/>
+          <w:bCs/>
+        </w:rPr>
+        <w:t xml:space="preserve"> </w:t>
+      </w:r>
+    </w:p>
+    <w:p>
+      <w:pPr>
+        <w:numPr>
+          <w:ilvl w:val="0"/>
+          <w:numId w:val="9"/>
+        </w:numPr>
+        <w:rPr>
+          <w:lang w:val="es-ES"/>
+        </w:rPr>
+      </w:pPr>
+      <w:r>
+        <w:rPr>
+          <w:lang w:val="es-ES"/>
+        </w:rPr>
+        <w:t xml:space="preserve">El </w:t>
+      </w:r>
+      <w:r>
+        <w:rPr>
+          <w:b/>
+          <w:bCs/>
+          <w:lang w:val="es-ES"/>
+        </w:rPr>
+        <w:t>IMU (unidad inercial)</w:t>
+      </w:r>
+      <w:r>
+        <w:rPr>
+          <w:lang w:val="es-ES"/>
+        </w:rPr>
+        <w:t xml:space="preserve"> publica orientación y aceleración.</w:t>
+      </w:r>
+    </w:p>
+    <w:p>
+      <w:pPr>
+        <w:numPr>
+          <w:ilvl w:val="0"/>
+          <w:numId w:val="9"/>
+        </w:numPr>
+        <w:rPr>
+          <w:lang w:val="es-ES"/>
+        </w:rPr>
+      </w:pPr>
+      <w:r>
+        <w:rPr>
+          <w:lang w:val="es-ES"/>
+        </w:rPr>
+        <w:t xml:space="preserve">Un nodo de navegación </w:t>
+      </w:r>
+      <w:r>
+        <w:rPr>
+          <w:b/>
+          <w:bCs/>
+          <w:lang w:val="es-ES"/>
+        </w:rPr>
+        <w:t>suscribe esa información</w:t>
+      </w:r>
+      <w:r>
+        <w:rPr>
+          <w:lang w:val="es-ES"/>
+        </w:rPr>
+        <w:t xml:space="preserve"> para estimar posición o detectar movimientos.</w:t>
+      </w:r>
+    </w:p>
+    <w:p>
+      <w:pPr>
+        <w:numPr>
+          <w:ilvl w:val="0"/>
+          <w:numId w:val="9"/>
+        </w:numPr>
+        <w:rPr>
+          <w:lang w:val="es-ES"/>
+        </w:rPr>
+      </w:pPr>
+      <w:r>
+        <w:rPr>
+          <w:lang w:val="es-ES"/>
+        </w:rPr>
+        <w:t>Puedes tener otro nodo que publique comandos de velocidad (/</w:t>
+      </w:r>
+      <w:proofErr w:type="spellStart"/>
+      <w:r>
+        <w:rPr>
+          <w:lang w:val="es-ES"/>
+        </w:rPr>
+        <w:t>cmd_vel</w:t>
+      </w:r>
+      <w:proofErr w:type="spellEnd"/>
+      <w:r>
+        <w:rPr>
+          <w:lang w:val="es-ES"/>
+        </w:rPr>
+        <w:t xml:space="preserve">) y un nodo controlador que los escuche para mover las ruedas </w:t>
+      </w:r>
+      <w:proofErr w:type="spellStart"/>
+      <w:r>
+        <w:rPr>
+          <w:lang w:val="es-ES"/>
+        </w:rPr>
+        <w:t>Mecanum</w:t>
+      </w:r>
+      <w:proofErr w:type="spellEnd"/>
+      <w:r>
+        <w:rPr>
+          <w:lang w:val="es-ES"/>
+        </w:rPr>
+        <w:t>.</w:t>
+      </w:r>
+    </w:p>
+    <w:p>
+      <w:pPr>
+        <w:rPr>
+          <w:lang w:val="es-ES"/>
+        </w:rPr>
+      </w:pPr>
+      <w:r>
+        <w:rPr>
+          <w:lang w:val="es-ES"/>
+        </w:rPr>
+        <w:t xml:space="preserve">2. CLIENT /SERVICE </w:t>
+      </w:r>
+    </w:p>
+    <w:p>
+      <w:pPr>
+        <w:rPr>
+          <w:lang w:val="es-ES"/>
+        </w:rPr>
+      </w:pPr>
+    </w:p>
+    <w:p>
+      <w:pPr>
+        <w:rPr>
+          <w:lang w:val="es-ES"/>
+        </w:rPr>
+      </w:pPr>
+      <w:r>
+        <w:rPr>
+          <w:lang w:val="es-ES"/>
+        </w:rPr>
+        <w:t xml:space="preserve">PATRON REQUERIDO CUANDO SE NECESITA UNA ACCION PUNTUAL </w:t>
+      </w:r>
+    </w:p>
+    <w:p>
+      <w:pPr>
+        <w:rPr>
+          <w:lang w:val="es-ES"/>
+        </w:rPr>
+      </w:pPr>
+    </w:p>
+    <w:tbl>
+      <w:tblPr>
+        <w:tblW w:w="0" w:type="auto"/>
+        <w:tblCellSpacing w:w="15" w:type="dxa"/>
+        <w:tblCellMar>
+          <w:top w:w="15" w:type="dxa"/>
+          <w:left w:w="15" w:type="dxa"/>
+          <w:bottom w:w="15" w:type="dxa"/>
+          <w:right w:w="15" w:type="dxa"/>
+        </w:tblCellMar>
+        <w:tblLook w:val="04A0" w:firstRow="1" w:lastRow="0" w:firstColumn="1" w:lastColumn="0" w:noHBand="0" w:noVBand="1"/>
+      </w:tblPr>
+      <w:tblGrid>
+        <w:gridCol w:w="1741"/>
+        <w:gridCol w:w="3593"/>
+        <w:gridCol w:w="3692"/>
+      </w:tblGrid>
+      <w:tr>
+        <w:trPr>
+          <w:tblHeader/>
+          <w:tblCellSpacing w:w="15" w:type="dxa"/>
+        </w:trPr>
+        <w:tc>
+          <w:tcPr>
+            <w:tcW w:w="0" w:type="auto"/>
+            <w:vAlign w:val="center"/>
+            <w:hideMark/>
+          </w:tcPr>
+          <w:p>
+            <w:pPr>
+              <w:rPr>
+                <w:b/>
+                <w:bCs/>
+              </w:rPr>
+            </w:pPr>
+            <w:r>
+              <w:rPr>
+                <w:b/>
+                <w:bCs/>
+              </w:rPr>
+              <w:t>Cliente</w:t>
+            </w:r>
+          </w:p>
+        </w:tc>
+        <w:tc>
+          <w:tcPr>
+            <w:tcW w:w="0" w:type="auto"/>
+            <w:vAlign w:val="center"/>
+            <w:hideMark/>
+          </w:tcPr>
+          <w:p>
+            <w:pPr>
+              <w:rPr>
+                <w:b/>
+                <w:bCs/>
+              </w:rPr>
+            </w:pPr>
+            <w:proofErr w:type="spellStart"/>
+            <w:r>
+              <w:rPr>
+                <w:b/>
+                <w:bCs/>
+              </w:rPr>
+              <w:t>Servidor</w:t>
+            </w:r>
+            <w:proofErr w:type="spellEnd"/>
+            <w:r>
+              <w:rPr>
+                <w:b/>
+                <w:bCs/>
+              </w:rPr>
+              <w:t xml:space="preserve"> (Service)</w:t>
+            </w:r>
+          </w:p>
+        </w:tc>
+        <w:tc>
+          <w:tcPr>
+            <w:tcW w:w="0" w:type="auto"/>
+            <w:vAlign w:val="center"/>
+            <w:hideMark/>
+          </w:tcPr>
+          <w:p>
+            <w:pPr>
+              <w:rPr>
+                <w:b/>
+                <w:bCs/>
+              </w:rPr>
+            </w:pPr>
+            <w:proofErr w:type="spellStart"/>
+            <w:r>
+              <w:rPr>
+                <w:b/>
+                <w:bCs/>
+              </w:rPr>
+              <w:t>Ejemplo</w:t>
+            </w:r>
+            <w:proofErr w:type="spellEnd"/>
+            <w:r>
+              <w:rPr>
+                <w:b/>
+                <w:bCs/>
+              </w:rPr>
+              <w:t xml:space="preserve"> robot</w:t>
+            </w:r>
+          </w:p>
+        </w:tc>
+      </w:tr>
+      <w:tr>
+        <w:trPr>
+          <w:tblCellSpacing w:w="15" w:type="dxa"/>
+        </w:trPr>
+        <w:tc>
+          <w:tcPr>
+            <w:tcW w:w="0" w:type="auto"/>
+            <w:vAlign w:val="center"/>
+            <w:hideMark/>
+          </w:tcPr>
+          <w:p>
+            <w:proofErr w:type="spellStart"/>
+            <w:r>
+              <w:t>Hace</w:t>
+            </w:r>
+            <w:proofErr w:type="spellEnd"/>
+            <w:r>
+              <w:t xml:space="preserve"> </w:t>
+            </w:r>
+            <w:proofErr w:type="spellStart"/>
+            <w:r>
+              <w:t>una</w:t>
+            </w:r>
+            <w:proofErr w:type="spellEnd"/>
+            <w:r>
+              <w:t xml:space="preserve"> </w:t>
+            </w:r>
+            <w:proofErr w:type="spellStart"/>
+            <w:r>
+              <w:t>solicitud</w:t>
+            </w:r>
+            <w:proofErr w:type="spellEnd"/>
+          </w:p>
+        </w:tc>
+        <w:tc>
+          <w:tcPr>
+            <w:tcW w:w="0" w:type="auto"/>
+            <w:vAlign w:val="center"/>
+            <w:hideMark/>
+          </w:tcPr>
+          <w:p>
+            <w:pPr>
+              <w:rPr>
+                <w:lang w:val="es-ES"/>
+              </w:rPr>
+            </w:pPr>
+            <w:r>
+              <w:rPr>
+                <w:lang w:val="es-ES"/>
+              </w:rPr>
+              <w:t>Ejecuta la acción y devuelve una respuesta</w:t>
+            </w:r>
+          </w:p>
+        </w:tc>
+        <w:tc>
+          <w:tcPr>
+            <w:tcW w:w="0" w:type="auto"/>
+            <w:vAlign w:val="center"/>
+            <w:hideMark/>
+          </w:tcPr>
+          <w:p>
+            <w:pPr>
+              <w:rPr>
+                <w:lang w:val="es-ES"/>
+              </w:rPr>
+            </w:pPr>
+            <w:r>
+              <w:rPr>
+                <w:lang w:val="es-ES"/>
+              </w:rPr>
+              <w:t>"Gira 90°" → el robot lo hace y responde "OK"</w:t>
+            </w:r>
+          </w:p>
+        </w:tc>
+      </w:tr>
+    </w:tbl>
+    <w:p>
+      <w:pPr>
+        <w:rPr>
+          <w:lang w:val="es-ES"/>
+        </w:rPr>
+      </w:pPr>
+    </w:p>
+    <w:p>
+      <w:pPr>
+        <w:jc w:val="center"/>
+        <w:rPr>
+          <w:lang w:val="es-ES"/>
+        </w:rPr>
+      </w:pPr>
+    </w:p>
+    <w:p>
+      <w:pPr>
+        <w:jc w:val="center"/>
+        <w:rPr>
+          <w:lang w:val="es-ES"/>
+        </w:rPr>
+      </w:pPr>
+    </w:p>
+    <w:p>
+      <w:pPr>
+        <w:jc w:val="center"/>
+        <w:rPr>
+          <w:lang w:val="es-ES"/>
+        </w:rPr>
+      </w:pPr>
+    </w:p>
+    <w:p>
+      <w:pPr>
+        <w:jc w:val="center"/>
+        <w:rPr>
+          <w:lang w:val="es-ES"/>
+        </w:rPr>
+      </w:pPr>
+    </w:p>
+    <w:tbl>
+      <w:tblPr>
+        <w:tblW w:w="0" w:type="auto"/>
+        <w:tblCellSpacing w:w="15" w:type="dxa"/>
+        <w:tblCellMar>
+          <w:top w:w="15" w:type="dxa"/>
+          <w:left w:w="15" w:type="dxa"/>
+          <w:bottom w:w="15" w:type="dxa"/>
+          <w:right w:w="15" w:type="dxa"/>
+        </w:tblCellMar>
+        <w:tblLook w:val="04A0" w:firstRow="1" w:lastRow="0" w:firstColumn="1" w:lastColumn="0" w:noHBand="0" w:noVBand="1"/>
+      </w:tblPr>
+      <w:tblGrid>
+        <w:gridCol w:w="3054"/>
+        <w:gridCol w:w="3931"/>
+        <w:gridCol w:w="2041"/>
+      </w:tblGrid>
+      <w:tr>
+        <w:trPr>
+          <w:tblHeader/>
+          <w:tblCellSpacing w:w="15" w:type="dxa"/>
+        </w:trPr>
+        <w:tc>
+          <w:tcPr>
+            <w:tcW w:w="0" w:type="auto"/>
+            <w:vAlign w:val="center"/>
+            <w:hideMark/>
+          </w:tcPr>
+          <w:p>
+            <w:pPr>
+              <w:jc w:val="center"/>
+              <w:rPr>
+                <w:b/>
+                <w:bCs/>
+              </w:rPr>
+            </w:pPr>
+            <w:proofErr w:type="spellStart"/>
+            <w:r>
+              <w:rPr>
+                <w:b/>
+                <w:bCs/>
+              </w:rPr>
+              <w:lastRenderedPageBreak/>
+              <w:t>Componente</w:t>
+            </w:r>
+            <w:proofErr w:type="spellEnd"/>
+          </w:p>
+        </w:tc>
+        <w:tc>
+          <w:tcPr>
+            <w:tcW w:w="0" w:type="auto"/>
+            <w:vAlign w:val="center"/>
+            <w:hideMark/>
+          </w:tcPr>
+          <w:p>
+            <w:pPr>
+              <w:jc w:val="center"/>
+              <w:rPr>
+                <w:b/>
+                <w:bCs/>
+              </w:rPr>
+            </w:pPr>
+            <w:r>
+              <w:rPr>
+                <w:b/>
+                <w:bCs/>
+              </w:rPr>
+              <w:t>Rol ROS2</w:t>
+            </w:r>
+          </w:p>
+        </w:tc>
+        <w:tc>
+          <w:tcPr>
+            <w:tcW w:w="0" w:type="auto"/>
+            <w:vAlign w:val="center"/>
+            <w:hideMark/>
+          </w:tcPr>
+          <w:p>
+            <w:pPr>
+              <w:jc w:val="center"/>
+              <w:rPr>
+                <w:b/>
+                <w:bCs/>
+              </w:rPr>
+            </w:pPr>
+            <w:r>
+              <w:rPr>
+                <w:b/>
+                <w:bCs/>
+              </w:rPr>
+              <w:t xml:space="preserve">Tipo de </w:t>
+            </w:r>
+            <w:proofErr w:type="spellStart"/>
+            <w:r>
+              <w:rPr>
+                <w:b/>
+                <w:bCs/>
+              </w:rPr>
+              <w:t>comunicación</w:t>
+            </w:r>
+            <w:proofErr w:type="spellEnd"/>
+          </w:p>
+        </w:tc>
+      </w:tr>
+      <w:tr>
+        <w:trPr>
+          <w:tblCellSpacing w:w="15" w:type="dxa"/>
+        </w:trPr>
+        <w:tc>
+          <w:tcPr>
+            <w:tcW w:w="0" w:type="auto"/>
+            <w:vAlign w:val="center"/>
+            <w:hideMark/>
+          </w:tcPr>
+          <w:p>
+            <w:pPr>
+              <w:jc w:val="center"/>
+            </w:pPr>
+            <w:r>
+              <w:rPr>
+                <w:b/>
+                <w:bCs/>
+              </w:rPr>
+              <w:t>IMU</w:t>
+            </w:r>
+            <w:r>
+              <w:t xml:space="preserve"> (</w:t>
+            </w:r>
+            <w:proofErr w:type="spellStart"/>
+            <w:r>
+              <w:t>unidad</w:t>
+            </w:r>
+            <w:proofErr w:type="spellEnd"/>
+            <w:r>
+              <w:t xml:space="preserve"> </w:t>
+            </w:r>
+            <w:proofErr w:type="spellStart"/>
+            <w:r>
+              <w:t>inercial</w:t>
+            </w:r>
+            <w:proofErr w:type="spellEnd"/>
+            <w:r>
+              <w:t>)</w:t>
+            </w:r>
+          </w:p>
+        </w:tc>
+        <w:tc>
+          <w:tcPr>
+            <w:tcW w:w="0" w:type="auto"/>
+            <w:vAlign w:val="center"/>
+            <w:hideMark/>
+          </w:tcPr>
+          <w:p>
+            <w:pPr>
+              <w:jc w:val="center"/>
+            </w:pPr>
+            <w:proofErr w:type="spellStart"/>
+            <w:r>
+              <w:t>Publicador</w:t>
+            </w:r>
+            <w:proofErr w:type="spellEnd"/>
+            <w:r>
+              <w:t xml:space="preserve"> de </w:t>
+            </w:r>
+            <w:proofErr w:type="spellStart"/>
+            <w:r>
+              <w:t>orientación</w:t>
+            </w:r>
+            <w:proofErr w:type="spellEnd"/>
+            <w:r>
+              <w:t>/</w:t>
+            </w:r>
+            <w:proofErr w:type="spellStart"/>
+            <w:r>
+              <w:t>velocidad</w:t>
+            </w:r>
+            <w:proofErr w:type="spellEnd"/>
+          </w:p>
+        </w:tc>
+        <w:tc>
+          <w:tcPr>
+            <w:tcW w:w="0" w:type="auto"/>
+            <w:vAlign w:val="center"/>
+            <w:hideMark/>
+          </w:tcPr>
+          <w:p>
+            <w:pPr>
+              <w:jc w:val="center"/>
+            </w:pPr>
+            <w:r>
+              <w:t>publisher</w:t>
+            </w:r>
+          </w:p>
+        </w:tc>
+      </w:tr>
+      <w:tr>
+        <w:trPr>
+          <w:tblCellSpacing w:w="15" w:type="dxa"/>
+        </w:trPr>
+        <w:tc>
+          <w:tcPr>
+            <w:tcW w:w="0" w:type="auto"/>
+            <w:vAlign w:val="center"/>
+            <w:hideMark/>
+          </w:tcPr>
+          <w:p>
+            <w:pPr>
+              <w:jc w:val="center"/>
+            </w:pPr>
+            <w:r>
+              <w:rPr>
+                <w:b/>
+                <w:bCs/>
+              </w:rPr>
+              <w:t xml:space="preserve">Encoders / </w:t>
+            </w:r>
+            <w:proofErr w:type="spellStart"/>
+            <w:r>
+              <w:rPr>
+                <w:b/>
+                <w:bCs/>
+              </w:rPr>
+              <w:t>motores</w:t>
+            </w:r>
+            <w:proofErr w:type="spellEnd"/>
+          </w:p>
+        </w:tc>
+        <w:tc>
+          <w:tcPr>
+            <w:tcW w:w="0" w:type="auto"/>
+            <w:vAlign w:val="center"/>
+            <w:hideMark/>
+          </w:tcPr>
+          <w:p>
+            <w:pPr>
+              <w:jc w:val="center"/>
+              <w:rPr>
+                <w:lang w:val="es-ES"/>
+              </w:rPr>
+            </w:pPr>
+            <w:r>
+              <w:rPr>
+                <w:lang w:val="es-ES"/>
+              </w:rPr>
+              <w:t xml:space="preserve">Publicadores de </w:t>
+            </w:r>
+            <w:proofErr w:type="spellStart"/>
+            <w:r>
+              <w:rPr>
+                <w:lang w:val="es-ES"/>
+              </w:rPr>
+              <w:t>odometría</w:t>
+            </w:r>
+            <w:proofErr w:type="spellEnd"/>
+            <w:r>
+              <w:rPr>
+                <w:lang w:val="es-ES"/>
+              </w:rPr>
+              <w:t xml:space="preserve"> y receptores de comandos</w:t>
+            </w:r>
+          </w:p>
+        </w:tc>
+        <w:tc>
+          <w:tcPr>
+            <w:tcW w:w="0" w:type="auto"/>
+            <w:vAlign w:val="center"/>
+            <w:hideMark/>
+          </w:tcPr>
+          <w:p>
+            <w:pPr>
+              <w:jc w:val="center"/>
+            </w:pPr>
+            <w:r>
+              <w:t>pub/sub</w:t>
+            </w:r>
+          </w:p>
+        </w:tc>
+      </w:tr>
+      <w:tr>
+        <w:trPr>
+          <w:tblCellSpacing w:w="15" w:type="dxa"/>
+        </w:trPr>
+        <w:tc>
+          <w:tcPr>
+            <w:tcW w:w="0" w:type="auto"/>
+            <w:vAlign w:val="center"/>
+            <w:hideMark/>
+          </w:tcPr>
+          <w:p>
+            <w:pPr>
+              <w:jc w:val="center"/>
+              <w:rPr>
+                <w:lang w:val="es-ES"/>
+              </w:rPr>
+            </w:pPr>
+            <w:r>
+              <w:rPr>
+                <w:b/>
+                <w:bCs/>
+                <w:lang w:val="es-ES"/>
+              </w:rPr>
+              <w:t>Nodo de control</w:t>
+            </w:r>
+            <w:r>
+              <w:rPr>
+                <w:lang w:val="es-ES"/>
+              </w:rPr>
+              <w:t xml:space="preserve"> (embebido en </w:t>
+            </w:r>
+            <w:proofErr w:type="spellStart"/>
+            <w:r>
+              <w:rPr>
+                <w:lang w:val="es-ES"/>
+              </w:rPr>
+              <w:t>RPi</w:t>
+            </w:r>
+            <w:proofErr w:type="spellEnd"/>
+            <w:r>
+              <w:rPr>
+                <w:lang w:val="es-ES"/>
+              </w:rPr>
+              <w:t>)</w:t>
+            </w:r>
+          </w:p>
+        </w:tc>
+        <w:tc>
+          <w:tcPr>
+            <w:tcW w:w="0" w:type="auto"/>
+            <w:vAlign w:val="center"/>
+            <w:hideMark/>
+          </w:tcPr>
+          <w:p>
+            <w:pPr>
+              <w:jc w:val="center"/>
+              <w:rPr>
+                <w:lang w:val="es-ES"/>
+              </w:rPr>
+            </w:pPr>
+            <w:r>
+              <w:rPr>
+                <w:lang w:val="es-ES"/>
+              </w:rPr>
+              <w:t>Suscriptor de datos / Publicador de comandos</w:t>
+            </w:r>
+          </w:p>
+        </w:tc>
+        <w:tc>
+          <w:tcPr>
+            <w:tcW w:w="0" w:type="auto"/>
+            <w:vAlign w:val="center"/>
+            <w:hideMark/>
+          </w:tcPr>
+          <w:p>
+            <w:pPr>
+              <w:jc w:val="center"/>
+            </w:pPr>
+            <w:r>
+              <w:t>pub/sub</w:t>
+            </w:r>
+          </w:p>
+        </w:tc>
+      </w:tr>
+      <w:tr>
+        <w:trPr>
+          <w:tblCellSpacing w:w="15" w:type="dxa"/>
+        </w:trPr>
+        <w:tc>
+          <w:tcPr>
+            <w:tcW w:w="0" w:type="auto"/>
+            <w:vAlign w:val="center"/>
+            <w:hideMark/>
+          </w:tcPr>
+          <w:p>
+            <w:pPr>
+              <w:jc w:val="center"/>
+              <w:rPr>
+                <w:lang w:val="es-ES"/>
+              </w:rPr>
+            </w:pPr>
+            <w:r>
+              <w:rPr>
+                <w:b/>
+                <w:bCs/>
+                <w:lang w:val="es-ES"/>
+              </w:rPr>
+              <w:t>Nodo de navegación</w:t>
+            </w:r>
+            <w:r>
+              <w:rPr>
+                <w:lang w:val="es-ES"/>
+              </w:rPr>
+              <w:t xml:space="preserve"> (SLAM o </w:t>
+            </w:r>
+            <w:proofErr w:type="spellStart"/>
+            <w:r>
+              <w:rPr>
+                <w:lang w:val="es-ES"/>
+              </w:rPr>
+              <w:t>Path</w:t>
+            </w:r>
+            <w:proofErr w:type="spellEnd"/>
+            <w:r>
+              <w:rPr>
+                <w:lang w:val="es-ES"/>
+              </w:rPr>
+              <w:t xml:space="preserve"> </w:t>
+            </w:r>
+            <w:proofErr w:type="spellStart"/>
+            <w:r>
+              <w:rPr>
+                <w:lang w:val="es-ES"/>
+              </w:rPr>
+              <w:t>planning</w:t>
+            </w:r>
+            <w:proofErr w:type="spellEnd"/>
+            <w:r>
+              <w:rPr>
+                <w:lang w:val="es-ES"/>
+              </w:rPr>
+              <w:t>)</w:t>
+            </w:r>
+          </w:p>
+        </w:tc>
+        <w:tc>
+          <w:tcPr>
+            <w:tcW w:w="0" w:type="auto"/>
+            <w:vAlign w:val="center"/>
+            <w:hideMark/>
+          </w:tcPr>
+          <w:p>
+            <w:pPr>
+              <w:jc w:val="center"/>
+              <w:rPr>
+                <w:lang w:val="es-ES"/>
+              </w:rPr>
+            </w:pPr>
+            <w:r>
+              <w:rPr>
+                <w:lang w:val="es-ES"/>
+              </w:rPr>
+              <w:t>Cliente de servicios / Subscriptor de mapa</w:t>
+            </w:r>
+          </w:p>
+        </w:tc>
+        <w:tc>
+          <w:tcPr>
+            <w:tcW w:w="0" w:type="auto"/>
+            <w:vAlign w:val="center"/>
+            <w:hideMark/>
+          </w:tcPr>
+          <w:p>
+            <w:pPr>
+              <w:jc w:val="center"/>
+            </w:pPr>
+            <w:r>
+              <w:t>services y subscribers</w:t>
+            </w:r>
+          </w:p>
+        </w:tc>
+      </w:tr>
+      <w:tr>
+        <w:trPr>
+          <w:tblCellSpacing w:w="15" w:type="dxa"/>
+        </w:trPr>
+        <w:tc>
+          <w:tcPr>
+            <w:tcW w:w="0" w:type="auto"/>
+            <w:vAlign w:val="center"/>
+            <w:hideMark/>
+          </w:tcPr>
+          <w:p>
+            <w:pPr>
+              <w:jc w:val="center"/>
+            </w:pPr>
+            <w:proofErr w:type="spellStart"/>
+            <w:r>
+              <w:rPr>
+                <w:b/>
+                <w:bCs/>
+              </w:rPr>
+              <w:t>Interfaz</w:t>
+            </w:r>
+            <w:proofErr w:type="spellEnd"/>
+            <w:r>
+              <w:rPr>
+                <w:b/>
+                <w:bCs/>
+              </w:rPr>
+              <w:t xml:space="preserve"> de </w:t>
+            </w:r>
+            <w:proofErr w:type="spellStart"/>
+            <w:r>
+              <w:rPr>
+                <w:b/>
+                <w:bCs/>
+              </w:rPr>
+              <w:t>usuario</w:t>
+            </w:r>
+            <w:proofErr w:type="spellEnd"/>
+            <w:r>
+              <w:rPr>
+                <w:b/>
+                <w:bCs/>
+              </w:rPr>
+              <w:t xml:space="preserve"> web</w:t>
+            </w:r>
+          </w:p>
+        </w:tc>
+        <w:tc>
+          <w:tcPr>
+            <w:tcW w:w="0" w:type="auto"/>
+            <w:vAlign w:val="center"/>
+            <w:hideMark/>
+          </w:tcPr>
+          <w:p>
+            <w:pPr>
+              <w:jc w:val="center"/>
+              <w:rPr>
+                <w:lang w:val="es-ES"/>
+              </w:rPr>
+            </w:pPr>
+            <w:r>
+              <w:rPr>
+                <w:lang w:val="es-ES"/>
+              </w:rPr>
+              <w:t>Cliente que envía comandos por ROS Bridge</w:t>
+            </w:r>
+          </w:p>
+        </w:tc>
+        <w:tc>
+          <w:tcPr>
+            <w:tcW w:w="0" w:type="auto"/>
+            <w:vAlign w:val="center"/>
+            <w:hideMark/>
+          </w:tcPr>
+          <w:p>
+            <w:pPr>
+              <w:jc w:val="center"/>
+            </w:pPr>
+            <w:r>
+              <w:t>service client</w:t>
+            </w:r>
+          </w:p>
+        </w:tc>
+      </w:tr>
+      <w:tr>
+        <w:trPr>
+          <w:tblCellSpacing w:w="15" w:type="dxa"/>
+        </w:trPr>
+        <w:tc>
+          <w:tcPr>
+            <w:tcW w:w="0" w:type="auto"/>
+            <w:vAlign w:val="center"/>
+            <w:hideMark/>
+          </w:tcPr>
+          <w:p>
+            <w:pPr>
+              <w:jc w:val="center"/>
+            </w:pPr>
+            <w:proofErr w:type="spellStart"/>
+            <w:r>
+              <w:rPr>
+                <w:b/>
+                <w:bCs/>
+              </w:rPr>
+              <w:t>Simulación</w:t>
+            </w:r>
+            <w:proofErr w:type="spellEnd"/>
+            <w:r>
+              <w:t xml:space="preserve"> (Rviz, Gazebo)</w:t>
+            </w:r>
+          </w:p>
+        </w:tc>
+        <w:tc>
+          <w:tcPr>
+            <w:tcW w:w="0" w:type="auto"/>
+            <w:vAlign w:val="center"/>
+            <w:hideMark/>
+          </w:tcPr>
+          <w:p>
+            <w:pPr>
+              <w:jc w:val="center"/>
+              <w:rPr>
+                <w:lang w:val="es-ES"/>
+              </w:rPr>
+            </w:pPr>
+            <w:r>
+              <w:rPr>
+                <w:lang w:val="es-ES"/>
+              </w:rPr>
+              <w:t>Visualización de sensores y estado</w:t>
+            </w:r>
+          </w:p>
+        </w:tc>
+        <w:tc>
+          <w:tcPr>
+            <w:tcW w:w="0" w:type="auto"/>
+            <w:vAlign w:val="center"/>
+            <w:hideMark/>
+          </w:tcPr>
+          <w:p>
+            <w:pPr>
+              <w:jc w:val="center"/>
+            </w:pPr>
+            <w:r>
+              <w:t>pub/sub</w:t>
+            </w:r>
+          </w:p>
+        </w:tc>
+      </w:tr>
+    </w:tbl>
     <w:p>
       <w:pPr>
         <w:jc w:val="center"/>
@@ -5139,6 +6559,155 @@
 <file path=word/numbering.xml><?xml version="1.0" encoding="utf-8"?>
 <w:numbering xmlns:wpc="http://schemas.microsoft.com/office/word/2010/wordprocessingCanvas" xmlns:cx="http://schemas.microsoft.com/office/drawing/2014/chartex" xmlns:cx1="http://schemas.microsoft.com/office/drawing/2015/9/8/chartex" xmlns:cx2="http://schemas.microsoft.com/office/drawing/2015/10/21/chartex" xmlns:cx3="http://schemas.microsoft.com/office/drawing/2016/5/9/chartex" xmlns:cx4="http://schemas.microsoft.com/office/drawing/2016/5/10/chartex" xmlns:cx5="http://schemas.microsoft.com/office/drawing/2016/5/11/chartex" xmlns:cx6="http://schemas.microsoft.com/office/drawing/2016/5/12/chartex" xmlns:cx7="http://schemas.microsoft.com/office/drawing/2016/5/13/chartex" xmlns:cx8="http://schemas.microsoft.com/office/drawing/2016/5/14/chartex" xmlns:mc="http://schemas.openxmlformats.org/markup-compatibility/2006" xmlns:aink="http://schemas.microsoft.com/office/drawing/2016/ink" xmlns:am3d="http://schemas.microsoft.com/office/drawing/2017/model3d" xmlns:o="urn:schemas-microsoft-com:office:office" xmlns:oel="http://schemas.microsoft.com/office/2019/extlst" xmlns:r="http://schemas.openxmlformats.org/officeDocument/2006/relationships" xmlns:m="http://schemas.openxmlformats.org/officeDocument/2006/math" xmlns:v="urn:schemas-microsoft-com:vml" xmlns:wp14="http://schemas.microsoft.com/office/word/2010/wordprocessingDrawing" xmlns:wp="http://schemas.openxmlformats.org/drawingml/2006/wordprocessingDrawing" xmlns:w10="urn:schemas-microsoft-com:office:word" xmlns:w="http://schemas.openxmlformats.org/wordprocessingml/2006/main" xmlns:w14="http://schemas.microsoft.com/office/word/2010/wordml" xmlns:w15="http://schemas.microsoft.com/office/word/2012/wordml" xmlns:w16cex="http://schemas.microsoft.com/office/word/2018/wordml/cex" xmlns:w16cid="http://schemas.microsoft.com/office/word/2016/wordml/cid" xmlns:w16="http://schemas.microsoft.com/office/word/2018/wordml" xmlns:w16du="http://schemas.microsoft.com/office/word/2023/wordml/word16du" xmlns:w16sdtdh="http://schemas.microsoft.com/office/word/2020/wordml/sdtdatahash" xmlns:w16sdtfl="http://schemas.microsoft.com/office/word/2024/wordml/sdtformatlock" xmlns:w16se="http://schemas.microsoft.com/office/word/2015/wordml/symex" xmlns:wpg="http://schemas.microsoft.com/office/word/2010/wordprocessingGroup" xmlns:wpi="http://schemas.microsoft.com/office/word/2010/wordprocessingInk" xmlns:wne="http://schemas.microsoft.com/office/word/2006/wordml" xmlns:wps="http://schemas.microsoft.com/office/word/2010/wordprocessingShape" mc:Ignorable="w14 w15 w16se w16cid w16 w16cex w16sdtdh w16sdtfl w16du wp14">
   <w:abstractNum w:abstractNumId="0" w15:restartNumberingAfterBreak="0">
+    <w:nsid w:val="0DE5371C"/>
+    <w:multiLevelType w:val="multilevel"/>
+    <w:tmpl w:val="EB84A8BC"/>
+    <w:lvl w:ilvl="0">
+      <w:start w:val="1"/>
+      <w:numFmt w:val="bullet"/>
+      <w:lvlText w:val=""/>
+      <w:lvlJc w:val="left"/>
+      <w:pPr>
+        <w:tabs>
+          <w:tab w:val="num" w:pos="720"/>
+        </w:tabs>
+        <w:ind w:left="720" w:hanging="360"/>
+      </w:pPr>
+      <w:rPr>
+        <w:rFonts w:ascii="Symbol" w:hAnsi="Symbol" w:hint="default"/>
+        <w:sz w:val="20"/>
+      </w:rPr>
+    </w:lvl>
+    <w:lvl w:ilvl="1" w:tentative="1">
+      <w:start w:val="1"/>
+      <w:numFmt w:val="bullet"/>
+      <w:lvlText w:val="o"/>
+      <w:lvlJc w:val="left"/>
+      <w:pPr>
+        <w:tabs>
+          <w:tab w:val="num" w:pos="1440"/>
+        </w:tabs>
+        <w:ind w:left="1440" w:hanging="360"/>
+      </w:pPr>
+      <w:rPr>
+        <w:rFonts w:ascii="Courier New" w:hAnsi="Courier New" w:hint="default"/>
+        <w:sz w:val="20"/>
+      </w:rPr>
+    </w:lvl>
+    <w:lvl w:ilvl="2" w:tentative="1">
+      <w:start w:val="1"/>
+      <w:numFmt w:val="bullet"/>
+      <w:lvlText w:val=""/>
+      <w:lvlJc w:val="left"/>
+      <w:pPr>
+        <w:tabs>
+          <w:tab w:val="num" w:pos="2160"/>
+        </w:tabs>
+        <w:ind w:left="2160" w:hanging="360"/>
+      </w:pPr>
+      <w:rPr>
+        <w:rFonts w:ascii="Wingdings" w:hAnsi="Wingdings" w:hint="default"/>
+        <w:sz w:val="20"/>
+      </w:rPr>
+    </w:lvl>
+    <w:lvl w:ilvl="3" w:tentative="1">
+      <w:start w:val="1"/>
+      <w:numFmt w:val="bullet"/>
+      <w:lvlText w:val=""/>
+      <w:lvlJc w:val="left"/>
+      <w:pPr>
+        <w:tabs>
+          <w:tab w:val="num" w:pos="2880"/>
+        </w:tabs>
+        <w:ind w:left="2880" w:hanging="360"/>
+      </w:pPr>
+      <w:rPr>
+        <w:rFonts w:ascii="Wingdings" w:hAnsi="Wingdings" w:hint="default"/>
+        <w:sz w:val="20"/>
+      </w:rPr>
+    </w:lvl>
+    <w:lvl w:ilvl="4" w:tentative="1">
+      <w:start w:val="1"/>
+      <w:numFmt w:val="bullet"/>
+      <w:lvlText w:val=""/>
+      <w:lvlJc w:val="left"/>
+      <w:pPr>
+        <w:tabs>
+          <w:tab w:val="num" w:pos="3600"/>
+        </w:tabs>
+        <w:ind w:left="3600" w:hanging="360"/>
+      </w:pPr>
+      <w:rPr>
+        <w:rFonts w:ascii="Wingdings" w:hAnsi="Wingdings" w:hint="default"/>
+        <w:sz w:val="20"/>
+      </w:rPr>
+    </w:lvl>
+    <w:lvl w:ilvl="5" w:tentative="1">
+      <w:start w:val="1"/>
+      <w:numFmt w:val="bullet"/>
+      <w:lvlText w:val=""/>
+      <w:lvlJc w:val="left"/>
+      <w:pPr>
+        <w:tabs>
+          <w:tab w:val="num" w:pos="4320"/>
+        </w:tabs>
+        <w:ind w:left="4320" w:hanging="360"/>
+      </w:pPr>
+      <w:rPr>
+        <w:rFonts w:ascii="Wingdings" w:hAnsi="Wingdings" w:hint="default"/>
+        <w:sz w:val="20"/>
+      </w:rPr>
+    </w:lvl>
+    <w:lvl w:ilvl="6" w:tentative="1">
+      <w:start w:val="1"/>
+      <w:numFmt w:val="bullet"/>
+      <w:lvlText w:val=""/>
+      <w:lvlJc w:val="left"/>
+      <w:pPr>
+        <w:tabs>
+          <w:tab w:val="num" w:pos="5040"/>
+        </w:tabs>
+        <w:ind w:left="5040" w:hanging="360"/>
+      </w:pPr>
+      <w:rPr>
+        <w:rFonts w:ascii="Wingdings" w:hAnsi="Wingdings" w:hint="default"/>
+        <w:sz w:val="20"/>
+      </w:rPr>
+    </w:lvl>
+    <w:lvl w:ilvl="7" w:tentative="1">
+      <w:start w:val="1"/>
+      <w:numFmt w:val="bullet"/>
+      <w:lvlText w:val=""/>
+      <w:lvlJc w:val="left"/>
+      <w:pPr>
+        <w:tabs>
+          <w:tab w:val="num" w:pos="5760"/>
+        </w:tabs>
+        <w:ind w:left="5760" w:hanging="360"/>
+      </w:pPr>
+      <w:rPr>
+        <w:rFonts w:ascii="Wingdings" w:hAnsi="Wingdings" w:hint="default"/>
+        <w:sz w:val="20"/>
+      </w:rPr>
+    </w:lvl>
+    <w:lvl w:ilvl="8" w:tentative="1">
+      <w:start w:val="1"/>
+      <w:numFmt w:val="bullet"/>
+      <w:lvlText w:val=""/>
+      <w:lvlJc w:val="left"/>
+      <w:pPr>
+        <w:tabs>
+          <w:tab w:val="num" w:pos="6480"/>
+        </w:tabs>
+        <w:ind w:left="6480" w:hanging="360"/>
+      </w:pPr>
+      <w:rPr>
+        <w:rFonts w:ascii="Wingdings" w:hAnsi="Wingdings" w:hint="default"/>
+        <w:sz w:val="20"/>
+      </w:rPr>
+    </w:lvl>
+  </w:abstractNum>
+  <w:abstractNum w:abstractNumId="1" w15:restartNumberingAfterBreak="0">
     <w:nsid w:val="18984780"/>
     <w:multiLevelType w:val="multilevel"/>
     <w:tmpl w:val="E4DA1CB2"/>
@@ -5283,7 +6852,7 @@
       </w:rPr>
     </w:lvl>
   </w:abstractNum>
-  <w:abstractNum w:abstractNumId="1" w15:restartNumberingAfterBreak="0">
+  <w:abstractNum w:abstractNumId="2" w15:restartNumberingAfterBreak="0">
     <w:nsid w:val="37EC271D"/>
     <w:multiLevelType w:val="hybridMultilevel"/>
     <w:tmpl w:val="9E141342"/>
@@ -5372,7 +6941,7 @@
       </w:pPr>
     </w:lvl>
   </w:abstractNum>
-  <w:abstractNum w:abstractNumId="2" w15:restartNumberingAfterBreak="0">
+  <w:abstractNum w:abstractNumId="3" w15:restartNumberingAfterBreak="0">
     <w:nsid w:val="44DF5E16"/>
     <w:multiLevelType w:val="multilevel"/>
     <w:tmpl w:val="E4DA1CB2"/>
@@ -5518,7 +7087,7 @@
       </w:rPr>
     </w:lvl>
   </w:abstractNum>
-  <w:abstractNum w:abstractNumId="3" w15:restartNumberingAfterBreak="0">
+  <w:abstractNum w:abstractNumId="4" w15:restartNumberingAfterBreak="0">
     <w:nsid w:val="4EB52D1F"/>
     <w:multiLevelType w:val="multilevel"/>
     <w:tmpl w:val="730AD6C6"/>
@@ -5667,7 +7236,7 @@
       </w:rPr>
     </w:lvl>
   </w:abstractNum>
-  <w:abstractNum w:abstractNumId="4" w15:restartNumberingAfterBreak="0">
+  <w:abstractNum w:abstractNumId="5" w15:restartNumberingAfterBreak="0">
     <w:nsid w:val="53006D62"/>
     <w:multiLevelType w:val="multilevel"/>
     <w:tmpl w:val="23CCD0FE"/>
@@ -5780,7 +7349,7 @@
       </w:rPr>
     </w:lvl>
   </w:abstractNum>
-  <w:abstractNum w:abstractNumId="5" w15:restartNumberingAfterBreak="0">
+  <w:abstractNum w:abstractNumId="6" w15:restartNumberingAfterBreak="0">
     <w:nsid w:val="636740D5"/>
     <w:multiLevelType w:val="multilevel"/>
     <w:tmpl w:val="FE38624C"/>
@@ -5929,7 +7498,7 @@
       </w:rPr>
     </w:lvl>
   </w:abstractNum>
-  <w:abstractNum w:abstractNumId="6" w15:restartNumberingAfterBreak="0">
+  <w:abstractNum w:abstractNumId="7" w15:restartNumberingAfterBreak="0">
     <w:nsid w:val="7A155154"/>
     <w:multiLevelType w:val="hybridMultilevel"/>
     <w:tmpl w:val="02F0FFCE"/>
@@ -6042,7 +7611,7 @@
       </w:rPr>
     </w:lvl>
   </w:abstractNum>
-  <w:abstractNum w:abstractNumId="7" w15:restartNumberingAfterBreak="0">
+  <w:abstractNum w:abstractNumId="8" w15:restartNumberingAfterBreak="0">
     <w:nsid w:val="7B750BCD"/>
     <w:multiLevelType w:val="hybridMultilevel"/>
     <w:tmpl w:val="25488C1C"/>
@@ -6155,28 +7724,31 @@
     </w:lvl>
   </w:abstractNum>
   <w:num w:numId="1" w16cid:durableId="1341930320">
+    <w:abstractNumId w:val="8"/>
+  </w:num>
+  <w:num w:numId="2" w16cid:durableId="39213036">
+    <w:abstractNumId w:val="2"/>
+  </w:num>
+  <w:num w:numId="3" w16cid:durableId="1838496810">
     <w:abstractNumId w:val="7"/>
   </w:num>
-  <w:num w:numId="2" w16cid:durableId="39213036">
+  <w:num w:numId="4" w16cid:durableId="1719813210">
     <w:abstractNumId w:val="1"/>
   </w:num>
-  <w:num w:numId="3" w16cid:durableId="1838496810">
+  <w:num w:numId="5" w16cid:durableId="1157570246">
     <w:abstractNumId w:val="6"/>
   </w:num>
-  <w:num w:numId="4" w16cid:durableId="1719813210">
-    <w:abstractNumId w:val="0"/>
+  <w:num w:numId="6" w16cid:durableId="2070222233">
+    <w:abstractNumId w:val="4"/>
   </w:num>
-  <w:num w:numId="5" w16cid:durableId="1157570246">
+  <w:num w:numId="7" w16cid:durableId="1001355461">
+    <w:abstractNumId w:val="3"/>
+  </w:num>
+  <w:num w:numId="8" w16cid:durableId="513231712">
     <w:abstractNumId w:val="5"/>
   </w:num>
-  <w:num w:numId="6" w16cid:durableId="2070222233">
-    <w:abstractNumId w:val="3"/>
-  </w:num>
-  <w:num w:numId="7" w16cid:durableId="1001355461">
-    <w:abstractNumId w:val="2"/>
-  </w:num>
-  <w:num w:numId="8" w16cid:durableId="513231712">
-    <w:abstractNumId w:val="4"/>
+  <w:num w:numId="9" w16cid:durableId="1685940609">
+    <w:abstractNumId w:val="0"/>
   </w:num>
 </w:numbering>
 </file>

</xml_diff>